<commit_message>
docs(bullyproof): boutique document styling - numbered sections on new pages, teal accents, branded footer with page numbers; all outgoing docs regenerated
</commit_message>
<xml_diff>
--- a/apps/bullyproof/docs/change-request/quote-2026-06-29/reply-2026-07-07/01-M2-M8-classification.docx
+++ b/apps/bullyproof/docs/change-request/quote-2026-06-29/reply-2026-07-07/01-M2-M8-classification.docx
@@ -5,108 +5,214 @@
     <w:p>
       <w:pPr>
         <w:pStyle w:val="Heading1"/>
+        <w:spacing w:after="80"/>
+        <w:pBdr>
+          <w:bottom w:val="single" w:sz="10" w:space="8" w:color="008490"/>
+        </w:pBdr>
       </w:pPr>
       <w:r>
         <w:rPr>
+          <w:rFonts w:ascii="Calibri" w:hAnsi="Calibri"/>
+          <w:b/>
           <w:color w:val="1F2937"/>
+          <w:sz w:val="50"/>
         </w:rPr>
         <w:t>M2-M8 scope classification</w:t>
       </w:r>
     </w:p>
     <w:p>
       <w:pPr>
-        <w:pStyle w:val="IntenseQuote"/>
+        <w:spacing w:before="80" w:after="200"/>
+        <w:ind w:left="280"/>
+        <w:pBdr>
+          <w:left w:val="single" w:sz="12" w:space="8" w:color="008490"/>
+        </w:pBdr>
       </w:pPr>
       <w:r>
+        <w:rPr>
+          <w:i/>
+          <w:color w:val="6B7280"/>
+          <w:sz w:val="21"/>
+        </w:rPr>
         <w:t>The line-by-line reconciliation requested in your 7 July letter, using your</w:t>
       </w:r>
     </w:p>
     <w:p>
       <w:pPr>
-        <w:pStyle w:val="IntenseQuote"/>
+        <w:spacing w:before="80" w:after="200"/>
+        <w:ind w:left="280"/>
+        <w:pBdr>
+          <w:left w:val="single" w:sz="12" w:space="8" w:color="008490"/>
+        </w:pBdr>
       </w:pPr>
       <w:r>
+        <w:rPr>
+          <w:i/>
+          <w:color w:val="6B7280"/>
+          <w:sz w:val="21"/>
+        </w:rPr>
         <w:t>categories. Every numbered item from the 22 June document is classified as:</w:t>
       </w:r>
     </w:p>
     <w:p>
       <w:pPr>
-        <w:pStyle w:val="IntenseQuote"/>
+        <w:spacing w:before="80" w:after="200"/>
+        <w:ind w:left="280"/>
+        <w:pBdr>
+          <w:left w:val="single" w:sz="12" w:space="8" w:color="008490"/>
+        </w:pBdr>
       </w:pPr>
       <w:r>
         <w:rPr>
           <w:b/>
+          <w:i/>
+          <w:color w:val="6B7280"/>
+          <w:sz w:val="21"/>
         </w:rPr>
         <w:t>A</w:t>
       </w:r>
       <w:r>
+        <w:rPr>
+          <w:i/>
+          <w:color w:val="6B7280"/>
+          <w:sz w:val="21"/>
+        </w:rPr>
         <w:t xml:space="preserve"> original SOW scope, </w:t>
       </w:r>
       <w:r>
         <w:rPr>
           <w:b/>
+          <w:i/>
+          <w:color w:val="6B7280"/>
+          <w:sz w:val="21"/>
         </w:rPr>
         <w:t>B</w:t>
       </w:r>
       <w:r>
+        <w:rPr>
+          <w:i/>
+          <w:color w:val="6B7280"/>
+          <w:sz w:val="21"/>
+        </w:rPr>
         <w:t xml:space="preserve"> signed Variation scope, </w:t>
       </w:r>
       <w:r>
         <w:rPr>
           <w:b/>
+          <w:i/>
+          <w:color w:val="6B7280"/>
+          <w:sz w:val="21"/>
         </w:rPr>
         <w:t>C</w:t>
       </w:r>
       <w:r>
+        <w:rPr>
+          <w:i/>
+          <w:color w:val="6B7280"/>
+          <w:sz w:val="21"/>
+        </w:rPr>
         <w:t xml:space="preserve"> defect,</w:t>
       </w:r>
     </w:p>
     <w:p>
       <w:pPr>
-        <w:pStyle w:val="IntenseQuote"/>
+        <w:spacing w:before="80" w:after="200"/>
+        <w:ind w:left="280"/>
+        <w:pBdr>
+          <w:left w:val="single" w:sz="12" w:space="8" w:color="008490"/>
+        </w:pBdr>
       </w:pPr>
       <w:r>
+        <w:rPr>
+          <w:i/>
+          <w:color w:val="6B7280"/>
+          <w:sz w:val="21"/>
+        </w:rPr>
         <w:t xml:space="preserve">warranty or incomplete implementation, or </w:t>
       </w:r>
       <w:r>
         <w:rPr>
           <w:b/>
+          <w:i/>
+          <w:color w:val="6B7280"/>
+          <w:sz w:val="21"/>
         </w:rPr>
         <w:t>D</w:t>
       </w:r>
       <w:r>
+        <w:rPr>
+          <w:i/>
+          <w:color w:val="6B7280"/>
+          <w:sz w:val="21"/>
+        </w:rPr>
         <w:t xml:space="preserve"> genuine new work. For A, B</w:t>
       </w:r>
     </w:p>
     <w:p>
       <w:pPr>
-        <w:pStyle w:val="IntenseQuote"/>
+        <w:spacing w:before="80" w:after="200"/>
+        <w:ind w:left="280"/>
+        <w:pBdr>
+          <w:left w:val="single" w:sz="12" w:space="8" w:color="008490"/>
+        </w:pBdr>
       </w:pPr>
       <w:r>
+        <w:rPr>
+          <w:i/>
+          <w:color w:val="6B7280"/>
+          <w:sz w:val="21"/>
+        </w:rPr>
         <w:t>and C the "Where it stands" column shows the work is already delivered or</w:t>
       </w:r>
     </w:p>
     <w:p>
       <w:pPr>
-        <w:pStyle w:val="IntenseQuote"/>
+        <w:spacing w:before="80" w:after="200"/>
+        <w:ind w:left="280"/>
+        <w:pBdr>
+          <w:left w:val="single" w:sz="12" w:space="8" w:color="008490"/>
+        </w:pBdr>
       </w:pPr>
       <w:r>
+        <w:rPr>
+          <w:i/>
+          <w:color w:val="6B7280"/>
+          <w:sz w:val="21"/>
+        </w:rPr>
         <w:t>fixed at no charge and verifiable in UAT today. Category D items are the</w:t>
       </w:r>
     </w:p>
     <w:p>
       <w:pPr>
-        <w:pStyle w:val="IntenseQuote"/>
+        <w:spacing w:before="80" w:after="200"/>
+        <w:ind w:left="280"/>
+        <w:pBdr>
+          <w:left w:val="single" w:sz="12" w:space="8" w:color="008490"/>
+        </w:pBdr>
       </w:pPr>
       <w:r>
+        <w:rPr>
+          <w:i/>
+          <w:color w:val="6B7280"/>
+          <w:sz w:val="21"/>
+        </w:rPr>
         <w:t>content of the M2-M8 quotes, priced as issued on 5 July (all modules</w:t>
       </w:r>
     </w:p>
     <w:p>
       <w:pPr>
-        <w:pStyle w:val="IntenseQuote"/>
+        <w:spacing w:before="80" w:after="200"/>
+        <w:ind w:left="280"/>
+        <w:pBdr>
+          <w:left w:val="single" w:sz="12" w:space="8" w:color="008490"/>
+        </w:pBdr>
       </w:pPr>
       <w:r>
+        <w:rPr>
+          <w:i/>
+          <w:color w:val="6B7280"/>
+          <w:sz w:val="21"/>
+        </w:rPr>
         <w:t>$171,350, or $137,080 ex GST with the whole-of-program discount).</w:t>
       </w:r>
     </w:p>
@@ -118,26 +224,29 @@
         <w:tblLook w:firstColumn="1" w:firstRow="1" w:lastColumn="0" w:lastRow="0" w:noHBand="0" w:noVBand="1" w:val="04A0"/>
       </w:tblPr>
       <w:tblGrid>
-        <w:gridCol w:w="2160"/>
-        <w:gridCol w:w="2160"/>
-        <w:gridCol w:w="2160"/>
-        <w:gridCol w:w="2160"/>
+        <w:gridCol w:w="2379"/>
+        <w:gridCol w:w="2379"/>
+        <w:gridCol w:w="2379"/>
+        <w:gridCol w:w="2379"/>
       </w:tblGrid>
       <w:tr>
         <w:tc>
           <w:tcPr>
-            <w:tcW w:type="dxa" w:w="2160"/>
+            <w:tcW w:type="dxa" w:w="2379"/>
+            <w:shd w:val="clear" w:fill="008490"/>
           </w:tcPr>
           <w:p>
             <w:r>
               <w:rPr>
                 <w:b/>
+                <w:color w:val="FFFFFF"/>
                 <w:sz w:val="19"/>
               </w:rPr>
             </w:r>
             <w:r>
               <w:rPr>
                 <w:b/>
+                <w:color w:val="FFFFFF"/>
                 <w:sz w:val="19"/>
               </w:rPr>
               <w:t>#</w:t>
@@ -146,18 +255,21 @@
         </w:tc>
         <w:tc>
           <w:tcPr>
-            <w:tcW w:type="dxa" w:w="2160"/>
+            <w:tcW w:type="dxa" w:w="2379"/>
+            <w:shd w:val="clear" w:fill="008490"/>
           </w:tcPr>
           <w:p>
             <w:r>
               <w:rPr>
                 <w:b/>
+                <w:color w:val="FFFFFF"/>
                 <w:sz w:val="19"/>
               </w:rPr>
             </w:r>
             <w:r>
               <w:rPr>
                 <w:b/>
+                <w:color w:val="FFFFFF"/>
                 <w:sz w:val="19"/>
               </w:rPr>
               <w:t>Item (22 June document)</w:t>
@@ -166,18 +278,21 @@
         </w:tc>
         <w:tc>
           <w:tcPr>
-            <w:tcW w:type="dxa" w:w="2160"/>
+            <w:tcW w:type="dxa" w:w="2379"/>
+            <w:shd w:val="clear" w:fill="008490"/>
           </w:tcPr>
           <w:p>
             <w:r>
               <w:rPr>
                 <w:b/>
+                <w:color w:val="FFFFFF"/>
                 <w:sz w:val="19"/>
               </w:rPr>
             </w:r>
             <w:r>
               <w:rPr>
                 <w:b/>
+                <w:color w:val="FFFFFF"/>
                 <w:sz w:val="19"/>
               </w:rPr>
               <w:t>Class</w:t>
@@ -186,18 +301,21 @@
         </w:tc>
         <w:tc>
           <w:tcPr>
-            <w:tcW w:type="dxa" w:w="2160"/>
+            <w:tcW w:type="dxa" w:w="2379"/>
+            <w:shd w:val="clear" w:fill="008490"/>
           </w:tcPr>
           <w:p>
             <w:r>
               <w:rPr>
                 <w:b/>
+                <w:color w:val="FFFFFF"/>
                 <w:sz w:val="19"/>
               </w:rPr>
             </w:r>
             <w:r>
               <w:rPr>
                 <w:b/>
+                <w:color w:val="FFFFFF"/>
                 <w:sz w:val="19"/>
               </w:rPr>
               <w:t>Where it stands</w:t>
@@ -208,7 +326,7 @@
       <w:tr>
         <w:tc>
           <w:tcPr>
-            <w:tcW w:type="dxa" w:w="2160"/>
+            <w:tcW w:type="dxa" w:w="2379"/>
           </w:tcPr>
           <w:p>
             <w:r>
@@ -226,7 +344,7 @@
         </w:tc>
         <w:tc>
           <w:tcPr>
-            <w:tcW w:type="dxa" w:w="2160"/>
+            <w:tcW w:type="dxa" w:w="2379"/>
           </w:tcPr>
           <w:p>
             <w:r>
@@ -244,7 +362,7 @@
         </w:tc>
         <w:tc>
           <w:tcPr>
-            <w:tcW w:type="dxa" w:w="2160"/>
+            <w:tcW w:type="dxa" w:w="2379"/>
           </w:tcPr>
           <w:p>
             <w:r>
@@ -262,7 +380,7 @@
         </w:tc>
         <w:tc>
           <w:tcPr>
-            <w:tcW w:type="dxa" w:w="2160"/>
+            <w:tcW w:type="dxa" w:w="2379"/>
           </w:tcPr>
           <w:p>
             <w:r>
@@ -282,7 +400,8 @@
       <w:tr>
         <w:tc>
           <w:tcPr>
-            <w:tcW w:type="dxa" w:w="2160"/>
+            <w:tcW w:type="dxa" w:w="2379"/>
+            <w:shd w:val="clear" w:fill="F2F7F7"/>
           </w:tcPr>
           <w:p>
             <w:r>
@@ -300,7 +419,8 @@
         </w:tc>
         <w:tc>
           <w:tcPr>
-            <w:tcW w:type="dxa" w:w="2160"/>
+            <w:tcW w:type="dxa" w:w="2379"/>
+            <w:shd w:val="clear" w:fill="F2F7F7"/>
           </w:tcPr>
           <w:p>
             <w:r>
@@ -318,7 +438,8 @@
         </w:tc>
         <w:tc>
           <w:tcPr>
-            <w:tcW w:type="dxa" w:w="2160"/>
+            <w:tcW w:type="dxa" w:w="2379"/>
+            <w:shd w:val="clear" w:fill="F2F7F7"/>
           </w:tcPr>
           <w:p>
             <w:r>
@@ -336,7 +457,8 @@
         </w:tc>
         <w:tc>
           <w:tcPr>
-            <w:tcW w:type="dxa" w:w="2160"/>
+            <w:tcW w:type="dxa" w:w="2379"/>
+            <w:shd w:val="clear" w:fill="F2F7F7"/>
           </w:tcPr>
           <w:p>
             <w:r>
@@ -356,7 +478,7 @@
       <w:tr>
         <w:tc>
           <w:tcPr>
-            <w:tcW w:type="dxa" w:w="2160"/>
+            <w:tcW w:type="dxa" w:w="2379"/>
           </w:tcPr>
           <w:p>
             <w:r>
@@ -374,7 +496,7 @@
         </w:tc>
         <w:tc>
           <w:tcPr>
-            <w:tcW w:type="dxa" w:w="2160"/>
+            <w:tcW w:type="dxa" w:w="2379"/>
           </w:tcPr>
           <w:p>
             <w:r>
@@ -392,7 +514,7 @@
         </w:tc>
         <w:tc>
           <w:tcPr>
-            <w:tcW w:type="dxa" w:w="2160"/>
+            <w:tcW w:type="dxa" w:w="2379"/>
           </w:tcPr>
           <w:p>
             <w:r>
@@ -410,7 +532,7 @@
         </w:tc>
         <w:tc>
           <w:tcPr>
-            <w:tcW w:type="dxa" w:w="2160"/>
+            <w:tcW w:type="dxa" w:w="2379"/>
           </w:tcPr>
           <w:p>
             <w:r>
@@ -430,7 +552,8 @@
       <w:tr>
         <w:tc>
           <w:tcPr>
-            <w:tcW w:type="dxa" w:w="2160"/>
+            <w:tcW w:type="dxa" w:w="2379"/>
+            <w:shd w:val="clear" w:fill="F2F7F7"/>
           </w:tcPr>
           <w:p>
             <w:r>
@@ -448,7 +571,8 @@
         </w:tc>
         <w:tc>
           <w:tcPr>
-            <w:tcW w:type="dxa" w:w="2160"/>
+            <w:tcW w:type="dxa" w:w="2379"/>
+            <w:shd w:val="clear" w:fill="F2F7F7"/>
           </w:tcPr>
           <w:p>
             <w:r>
@@ -466,7 +590,8 @@
         </w:tc>
         <w:tc>
           <w:tcPr>
-            <w:tcW w:type="dxa" w:w="2160"/>
+            <w:tcW w:type="dxa" w:w="2379"/>
+            <w:shd w:val="clear" w:fill="F2F7F7"/>
           </w:tcPr>
           <w:p>
             <w:r>
@@ -484,7 +609,8 @@
         </w:tc>
         <w:tc>
           <w:tcPr>
-            <w:tcW w:type="dxa" w:w="2160"/>
+            <w:tcW w:type="dxa" w:w="2379"/>
+            <w:shd w:val="clear" w:fill="F2F7F7"/>
           </w:tcPr>
           <w:p>
             <w:r>
@@ -504,7 +630,7 @@
       <w:tr>
         <w:tc>
           <w:tcPr>
-            <w:tcW w:type="dxa" w:w="2160"/>
+            <w:tcW w:type="dxa" w:w="2379"/>
           </w:tcPr>
           <w:p>
             <w:r>
@@ -522,7 +648,7 @@
         </w:tc>
         <w:tc>
           <w:tcPr>
-            <w:tcW w:type="dxa" w:w="2160"/>
+            <w:tcW w:type="dxa" w:w="2379"/>
           </w:tcPr>
           <w:p>
             <w:r>
@@ -540,7 +666,7 @@
         </w:tc>
         <w:tc>
           <w:tcPr>
-            <w:tcW w:type="dxa" w:w="2160"/>
+            <w:tcW w:type="dxa" w:w="2379"/>
           </w:tcPr>
           <w:p>
             <w:r>
@@ -558,7 +684,7 @@
         </w:tc>
         <w:tc>
           <w:tcPr>
-            <w:tcW w:type="dxa" w:w="2160"/>
+            <w:tcW w:type="dxa" w:w="2379"/>
           </w:tcPr>
           <w:p>
             <w:r>
@@ -578,7 +704,8 @@
       <w:tr>
         <w:tc>
           <w:tcPr>
-            <w:tcW w:type="dxa" w:w="2160"/>
+            <w:tcW w:type="dxa" w:w="2379"/>
+            <w:shd w:val="clear" w:fill="F2F7F7"/>
           </w:tcPr>
           <w:p>
             <w:r>
@@ -596,7 +723,8 @@
         </w:tc>
         <w:tc>
           <w:tcPr>
-            <w:tcW w:type="dxa" w:w="2160"/>
+            <w:tcW w:type="dxa" w:w="2379"/>
+            <w:shd w:val="clear" w:fill="F2F7F7"/>
           </w:tcPr>
           <w:p>
             <w:r>
@@ -614,7 +742,8 @@
         </w:tc>
         <w:tc>
           <w:tcPr>
-            <w:tcW w:type="dxa" w:w="2160"/>
+            <w:tcW w:type="dxa" w:w="2379"/>
+            <w:shd w:val="clear" w:fill="F2F7F7"/>
           </w:tcPr>
           <w:p>
             <w:r>
@@ -632,7 +761,8 @@
         </w:tc>
         <w:tc>
           <w:tcPr>
-            <w:tcW w:type="dxa" w:w="2160"/>
+            <w:tcW w:type="dxa" w:w="2379"/>
+            <w:shd w:val="clear" w:fill="F2F7F7"/>
           </w:tcPr>
           <w:p>
             <w:r>
@@ -652,7 +782,7 @@
       <w:tr>
         <w:tc>
           <w:tcPr>
-            <w:tcW w:type="dxa" w:w="2160"/>
+            <w:tcW w:type="dxa" w:w="2379"/>
           </w:tcPr>
           <w:p>
             <w:r>
@@ -670,7 +800,7 @@
         </w:tc>
         <w:tc>
           <w:tcPr>
-            <w:tcW w:type="dxa" w:w="2160"/>
+            <w:tcW w:type="dxa" w:w="2379"/>
           </w:tcPr>
           <w:p>
             <w:r>
@@ -688,7 +818,7 @@
         </w:tc>
         <w:tc>
           <w:tcPr>
-            <w:tcW w:type="dxa" w:w="2160"/>
+            <w:tcW w:type="dxa" w:w="2379"/>
           </w:tcPr>
           <w:p>
             <w:r>
@@ -706,7 +836,7 @@
         </w:tc>
         <w:tc>
           <w:tcPr>
-            <w:tcW w:type="dxa" w:w="2160"/>
+            <w:tcW w:type="dxa" w:w="2379"/>
           </w:tcPr>
           <w:p>
             <w:r>
@@ -726,7 +856,8 @@
       <w:tr>
         <w:tc>
           <w:tcPr>
-            <w:tcW w:type="dxa" w:w="2160"/>
+            <w:tcW w:type="dxa" w:w="2379"/>
+            <w:shd w:val="clear" w:fill="F2F7F7"/>
           </w:tcPr>
           <w:p>
             <w:r>
@@ -744,7 +875,8 @@
         </w:tc>
         <w:tc>
           <w:tcPr>
-            <w:tcW w:type="dxa" w:w="2160"/>
+            <w:tcW w:type="dxa" w:w="2379"/>
+            <w:shd w:val="clear" w:fill="F2F7F7"/>
           </w:tcPr>
           <w:p>
             <w:r>
@@ -762,7 +894,8 @@
         </w:tc>
         <w:tc>
           <w:tcPr>
-            <w:tcW w:type="dxa" w:w="2160"/>
+            <w:tcW w:type="dxa" w:w="2379"/>
+            <w:shd w:val="clear" w:fill="F2F7F7"/>
           </w:tcPr>
           <w:p>
             <w:r>
@@ -780,7 +913,8 @@
         </w:tc>
         <w:tc>
           <w:tcPr>
-            <w:tcW w:type="dxa" w:w="2160"/>
+            <w:tcW w:type="dxa" w:w="2379"/>
+            <w:shd w:val="clear" w:fill="F2F7F7"/>
           </w:tcPr>
           <w:p>
             <w:r>
@@ -800,7 +934,7 @@
       <w:tr>
         <w:tc>
           <w:tcPr>
-            <w:tcW w:type="dxa" w:w="2160"/>
+            <w:tcW w:type="dxa" w:w="2379"/>
           </w:tcPr>
           <w:p>
             <w:r>
@@ -818,7 +952,7 @@
         </w:tc>
         <w:tc>
           <w:tcPr>
-            <w:tcW w:type="dxa" w:w="2160"/>
+            <w:tcW w:type="dxa" w:w="2379"/>
           </w:tcPr>
           <w:p>
             <w:r>
@@ -836,7 +970,7 @@
         </w:tc>
         <w:tc>
           <w:tcPr>
-            <w:tcW w:type="dxa" w:w="2160"/>
+            <w:tcW w:type="dxa" w:w="2379"/>
           </w:tcPr>
           <w:p>
             <w:r>
@@ -854,7 +988,7 @@
         </w:tc>
         <w:tc>
           <w:tcPr>
-            <w:tcW w:type="dxa" w:w="2160"/>
+            <w:tcW w:type="dxa" w:w="2379"/>
           </w:tcPr>
           <w:p>
             <w:r>
@@ -874,7 +1008,8 @@
       <w:tr>
         <w:tc>
           <w:tcPr>
-            <w:tcW w:type="dxa" w:w="2160"/>
+            <w:tcW w:type="dxa" w:w="2379"/>
+            <w:shd w:val="clear" w:fill="F2F7F7"/>
           </w:tcPr>
           <w:p>
             <w:r>
@@ -892,7 +1027,8 @@
         </w:tc>
         <w:tc>
           <w:tcPr>
-            <w:tcW w:type="dxa" w:w="2160"/>
+            <w:tcW w:type="dxa" w:w="2379"/>
+            <w:shd w:val="clear" w:fill="F2F7F7"/>
           </w:tcPr>
           <w:p>
             <w:r>
@@ -910,7 +1046,8 @@
         </w:tc>
         <w:tc>
           <w:tcPr>
-            <w:tcW w:type="dxa" w:w="2160"/>
+            <w:tcW w:type="dxa" w:w="2379"/>
+            <w:shd w:val="clear" w:fill="F2F7F7"/>
           </w:tcPr>
           <w:p>
             <w:r>
@@ -928,7 +1065,8 @@
         </w:tc>
         <w:tc>
           <w:tcPr>
-            <w:tcW w:type="dxa" w:w="2160"/>
+            <w:tcW w:type="dxa" w:w="2379"/>
+            <w:shd w:val="clear" w:fill="F2F7F7"/>
           </w:tcPr>
           <w:p>
             <w:r>
@@ -948,7 +1086,7 @@
       <w:tr>
         <w:tc>
           <w:tcPr>
-            <w:tcW w:type="dxa" w:w="2160"/>
+            <w:tcW w:type="dxa" w:w="2379"/>
           </w:tcPr>
           <w:p>
             <w:r>
@@ -966,7 +1104,7 @@
         </w:tc>
         <w:tc>
           <w:tcPr>
-            <w:tcW w:type="dxa" w:w="2160"/>
+            <w:tcW w:type="dxa" w:w="2379"/>
           </w:tcPr>
           <w:p>
             <w:r>
@@ -984,7 +1122,7 @@
         </w:tc>
         <w:tc>
           <w:tcPr>
-            <w:tcW w:type="dxa" w:w="2160"/>
+            <w:tcW w:type="dxa" w:w="2379"/>
           </w:tcPr>
           <w:p>
             <w:r>
@@ -1002,7 +1140,7 @@
         </w:tc>
         <w:tc>
           <w:tcPr>
-            <w:tcW w:type="dxa" w:w="2160"/>
+            <w:tcW w:type="dxa" w:w="2379"/>
           </w:tcPr>
           <w:p>
             <w:r>
@@ -1022,7 +1160,8 @@
       <w:tr>
         <w:tc>
           <w:tcPr>
-            <w:tcW w:type="dxa" w:w="2160"/>
+            <w:tcW w:type="dxa" w:w="2379"/>
+            <w:shd w:val="clear" w:fill="F2F7F7"/>
           </w:tcPr>
           <w:p>
             <w:r>
@@ -1040,7 +1179,8 @@
         </w:tc>
         <w:tc>
           <w:tcPr>
-            <w:tcW w:type="dxa" w:w="2160"/>
+            <w:tcW w:type="dxa" w:w="2379"/>
+            <w:shd w:val="clear" w:fill="F2F7F7"/>
           </w:tcPr>
           <w:p>
             <w:r>
@@ -1058,7 +1198,8 @@
         </w:tc>
         <w:tc>
           <w:tcPr>
-            <w:tcW w:type="dxa" w:w="2160"/>
+            <w:tcW w:type="dxa" w:w="2379"/>
+            <w:shd w:val="clear" w:fill="F2F7F7"/>
           </w:tcPr>
           <w:p>
             <w:r>
@@ -1076,7 +1217,8 @@
         </w:tc>
         <w:tc>
           <w:tcPr>
-            <w:tcW w:type="dxa" w:w="2160"/>
+            <w:tcW w:type="dxa" w:w="2379"/>
+            <w:shd w:val="clear" w:fill="F2F7F7"/>
           </w:tcPr>
           <w:p>
             <w:r>
@@ -1096,7 +1238,7 @@
       <w:tr>
         <w:tc>
           <w:tcPr>
-            <w:tcW w:type="dxa" w:w="2160"/>
+            <w:tcW w:type="dxa" w:w="2379"/>
           </w:tcPr>
           <w:p>
             <w:r>
@@ -1114,7 +1256,7 @@
         </w:tc>
         <w:tc>
           <w:tcPr>
-            <w:tcW w:type="dxa" w:w="2160"/>
+            <w:tcW w:type="dxa" w:w="2379"/>
           </w:tcPr>
           <w:p>
             <w:r>
@@ -1132,7 +1274,7 @@
         </w:tc>
         <w:tc>
           <w:tcPr>
-            <w:tcW w:type="dxa" w:w="2160"/>
+            <w:tcW w:type="dxa" w:w="2379"/>
           </w:tcPr>
           <w:p>
             <w:r>
@@ -1150,7 +1292,7 @@
         </w:tc>
         <w:tc>
           <w:tcPr>
-            <w:tcW w:type="dxa" w:w="2160"/>
+            <w:tcW w:type="dxa" w:w="2379"/>
           </w:tcPr>
           <w:p>
             <w:r>
@@ -1170,7 +1312,8 @@
       <w:tr>
         <w:tc>
           <w:tcPr>
-            <w:tcW w:type="dxa" w:w="2160"/>
+            <w:tcW w:type="dxa" w:w="2379"/>
+            <w:shd w:val="clear" w:fill="F2F7F7"/>
           </w:tcPr>
           <w:p>
             <w:r>
@@ -1188,7 +1331,8 @@
         </w:tc>
         <w:tc>
           <w:tcPr>
-            <w:tcW w:type="dxa" w:w="2160"/>
+            <w:tcW w:type="dxa" w:w="2379"/>
+            <w:shd w:val="clear" w:fill="F2F7F7"/>
           </w:tcPr>
           <w:p>
             <w:r>
@@ -1206,7 +1350,8 @@
         </w:tc>
         <w:tc>
           <w:tcPr>
-            <w:tcW w:type="dxa" w:w="2160"/>
+            <w:tcW w:type="dxa" w:w="2379"/>
+            <w:shd w:val="clear" w:fill="F2F7F7"/>
           </w:tcPr>
           <w:p>
             <w:r>
@@ -1224,7 +1369,8 @@
         </w:tc>
         <w:tc>
           <w:tcPr>
-            <w:tcW w:type="dxa" w:w="2160"/>
+            <w:tcW w:type="dxa" w:w="2379"/>
+            <w:shd w:val="clear" w:fill="F2F7F7"/>
           </w:tcPr>
           <w:p>
             <w:r>
@@ -1244,7 +1390,7 @@
       <w:tr>
         <w:tc>
           <w:tcPr>
-            <w:tcW w:type="dxa" w:w="2160"/>
+            <w:tcW w:type="dxa" w:w="2379"/>
           </w:tcPr>
           <w:p>
             <w:r>
@@ -1262,7 +1408,7 @@
         </w:tc>
         <w:tc>
           <w:tcPr>
-            <w:tcW w:type="dxa" w:w="2160"/>
+            <w:tcW w:type="dxa" w:w="2379"/>
           </w:tcPr>
           <w:p>
             <w:r>
@@ -1280,7 +1426,7 @@
         </w:tc>
         <w:tc>
           <w:tcPr>
-            <w:tcW w:type="dxa" w:w="2160"/>
+            <w:tcW w:type="dxa" w:w="2379"/>
           </w:tcPr>
           <w:p>
             <w:r>
@@ -1298,7 +1444,7 @@
         </w:tc>
         <w:tc>
           <w:tcPr>
-            <w:tcW w:type="dxa" w:w="2160"/>
+            <w:tcW w:type="dxa" w:w="2379"/>
           </w:tcPr>
           <w:p>
             <w:r>
@@ -1318,7 +1464,8 @@
       <w:tr>
         <w:tc>
           <w:tcPr>
-            <w:tcW w:type="dxa" w:w="2160"/>
+            <w:tcW w:type="dxa" w:w="2379"/>
+            <w:shd w:val="clear" w:fill="F2F7F7"/>
           </w:tcPr>
           <w:p>
             <w:r>
@@ -1336,7 +1483,8 @@
         </w:tc>
         <w:tc>
           <w:tcPr>
-            <w:tcW w:type="dxa" w:w="2160"/>
+            <w:tcW w:type="dxa" w:w="2379"/>
+            <w:shd w:val="clear" w:fill="F2F7F7"/>
           </w:tcPr>
           <w:p>
             <w:r>
@@ -1354,7 +1502,8 @@
         </w:tc>
         <w:tc>
           <w:tcPr>
-            <w:tcW w:type="dxa" w:w="2160"/>
+            <w:tcW w:type="dxa" w:w="2379"/>
+            <w:shd w:val="clear" w:fill="F2F7F7"/>
           </w:tcPr>
           <w:p>
             <w:r>
@@ -1372,7 +1521,8 @@
         </w:tc>
         <w:tc>
           <w:tcPr>
-            <w:tcW w:type="dxa" w:w="2160"/>
+            <w:tcW w:type="dxa" w:w="2379"/>
+            <w:shd w:val="clear" w:fill="F2F7F7"/>
           </w:tcPr>
           <w:p>
             <w:r>
@@ -1392,7 +1542,7 @@
       <w:tr>
         <w:tc>
           <w:tcPr>
-            <w:tcW w:type="dxa" w:w="2160"/>
+            <w:tcW w:type="dxa" w:w="2379"/>
           </w:tcPr>
           <w:p>
             <w:r>
@@ -1410,7 +1560,7 @@
         </w:tc>
         <w:tc>
           <w:tcPr>
-            <w:tcW w:type="dxa" w:w="2160"/>
+            <w:tcW w:type="dxa" w:w="2379"/>
           </w:tcPr>
           <w:p>
             <w:r>
@@ -1428,7 +1578,7 @@
         </w:tc>
         <w:tc>
           <w:tcPr>
-            <w:tcW w:type="dxa" w:w="2160"/>
+            <w:tcW w:type="dxa" w:w="2379"/>
           </w:tcPr>
           <w:p>
             <w:r>
@@ -1446,7 +1596,7 @@
         </w:tc>
         <w:tc>
           <w:tcPr>
-            <w:tcW w:type="dxa" w:w="2160"/>
+            <w:tcW w:type="dxa" w:w="2379"/>
           </w:tcPr>
           <w:p>
             <w:r>
@@ -1466,7 +1616,8 @@
       <w:tr>
         <w:tc>
           <w:tcPr>
-            <w:tcW w:type="dxa" w:w="2160"/>
+            <w:tcW w:type="dxa" w:w="2379"/>
+            <w:shd w:val="clear" w:fill="F2F7F7"/>
           </w:tcPr>
           <w:p>
             <w:r>
@@ -1484,7 +1635,8 @@
         </w:tc>
         <w:tc>
           <w:tcPr>
-            <w:tcW w:type="dxa" w:w="2160"/>
+            <w:tcW w:type="dxa" w:w="2379"/>
+            <w:shd w:val="clear" w:fill="F2F7F7"/>
           </w:tcPr>
           <w:p>
             <w:r>
@@ -1502,7 +1654,8 @@
         </w:tc>
         <w:tc>
           <w:tcPr>
-            <w:tcW w:type="dxa" w:w="2160"/>
+            <w:tcW w:type="dxa" w:w="2379"/>
+            <w:shd w:val="clear" w:fill="F2F7F7"/>
           </w:tcPr>
           <w:p>
             <w:r>
@@ -1520,7 +1673,8 @@
         </w:tc>
         <w:tc>
           <w:tcPr>
-            <w:tcW w:type="dxa" w:w="2160"/>
+            <w:tcW w:type="dxa" w:w="2379"/>
+            <w:shd w:val="clear" w:fill="F2F7F7"/>
           </w:tcPr>
           <w:p>
             <w:r>
@@ -1540,7 +1694,7 @@
       <w:tr>
         <w:tc>
           <w:tcPr>
-            <w:tcW w:type="dxa" w:w="2160"/>
+            <w:tcW w:type="dxa" w:w="2379"/>
           </w:tcPr>
           <w:p>
             <w:r>
@@ -1558,7 +1712,7 @@
         </w:tc>
         <w:tc>
           <w:tcPr>
-            <w:tcW w:type="dxa" w:w="2160"/>
+            <w:tcW w:type="dxa" w:w="2379"/>
           </w:tcPr>
           <w:p>
             <w:r>
@@ -1576,7 +1730,7 @@
         </w:tc>
         <w:tc>
           <w:tcPr>
-            <w:tcW w:type="dxa" w:w="2160"/>
+            <w:tcW w:type="dxa" w:w="2379"/>
           </w:tcPr>
           <w:p>
             <w:r>
@@ -1594,7 +1748,7 @@
         </w:tc>
         <w:tc>
           <w:tcPr>
-            <w:tcW w:type="dxa" w:w="2160"/>
+            <w:tcW w:type="dxa" w:w="2379"/>
           </w:tcPr>
           <w:p>
             <w:r>
@@ -1614,7 +1768,8 @@
       <w:tr>
         <w:tc>
           <w:tcPr>
-            <w:tcW w:type="dxa" w:w="2160"/>
+            <w:tcW w:type="dxa" w:w="2379"/>
+            <w:shd w:val="clear" w:fill="F2F7F7"/>
           </w:tcPr>
           <w:p>
             <w:r>
@@ -1632,7 +1787,8 @@
         </w:tc>
         <w:tc>
           <w:tcPr>
-            <w:tcW w:type="dxa" w:w="2160"/>
+            <w:tcW w:type="dxa" w:w="2379"/>
+            <w:shd w:val="clear" w:fill="F2F7F7"/>
           </w:tcPr>
           <w:p>
             <w:r>
@@ -1650,7 +1806,8 @@
         </w:tc>
         <w:tc>
           <w:tcPr>
-            <w:tcW w:type="dxa" w:w="2160"/>
+            <w:tcW w:type="dxa" w:w="2379"/>
+            <w:shd w:val="clear" w:fill="F2F7F7"/>
           </w:tcPr>
           <w:p>
             <w:r>
@@ -1668,7 +1825,8 @@
         </w:tc>
         <w:tc>
           <w:tcPr>
-            <w:tcW w:type="dxa" w:w="2160"/>
+            <w:tcW w:type="dxa" w:w="2379"/>
+            <w:shd w:val="clear" w:fill="F2F7F7"/>
           </w:tcPr>
           <w:p>
             <w:r>
@@ -1688,7 +1846,7 @@
       <w:tr>
         <w:tc>
           <w:tcPr>
-            <w:tcW w:type="dxa" w:w="2160"/>
+            <w:tcW w:type="dxa" w:w="2379"/>
           </w:tcPr>
           <w:p>
             <w:r>
@@ -1706,7 +1864,7 @@
         </w:tc>
         <w:tc>
           <w:tcPr>
-            <w:tcW w:type="dxa" w:w="2160"/>
+            <w:tcW w:type="dxa" w:w="2379"/>
           </w:tcPr>
           <w:p>
             <w:r>
@@ -1724,7 +1882,7 @@
         </w:tc>
         <w:tc>
           <w:tcPr>
-            <w:tcW w:type="dxa" w:w="2160"/>
+            <w:tcW w:type="dxa" w:w="2379"/>
           </w:tcPr>
           <w:p>
             <w:r>
@@ -1742,7 +1900,7 @@
         </w:tc>
         <w:tc>
           <w:tcPr>
-            <w:tcW w:type="dxa" w:w="2160"/>
+            <w:tcW w:type="dxa" w:w="2379"/>
           </w:tcPr>
           <w:p>
             <w:r>
@@ -1762,7 +1920,8 @@
       <w:tr>
         <w:tc>
           <w:tcPr>
-            <w:tcW w:type="dxa" w:w="2160"/>
+            <w:tcW w:type="dxa" w:w="2379"/>
+            <w:shd w:val="clear" w:fill="F2F7F7"/>
           </w:tcPr>
           <w:p>
             <w:r>
@@ -1780,7 +1939,8 @@
         </w:tc>
         <w:tc>
           <w:tcPr>
-            <w:tcW w:type="dxa" w:w="2160"/>
+            <w:tcW w:type="dxa" w:w="2379"/>
+            <w:shd w:val="clear" w:fill="F2F7F7"/>
           </w:tcPr>
           <w:p>
             <w:r>
@@ -1798,7 +1958,8 @@
         </w:tc>
         <w:tc>
           <w:tcPr>
-            <w:tcW w:type="dxa" w:w="2160"/>
+            <w:tcW w:type="dxa" w:w="2379"/>
+            <w:shd w:val="clear" w:fill="F2F7F7"/>
           </w:tcPr>
           <w:p>
             <w:r>
@@ -1816,7 +1977,8 @@
         </w:tc>
         <w:tc>
           <w:tcPr>
-            <w:tcW w:type="dxa" w:w="2160"/>
+            <w:tcW w:type="dxa" w:w="2379"/>
+            <w:shd w:val="clear" w:fill="F2F7F7"/>
           </w:tcPr>
           <w:p>
             <w:r>
@@ -1836,7 +1998,7 @@
       <w:tr>
         <w:tc>
           <w:tcPr>
-            <w:tcW w:type="dxa" w:w="2160"/>
+            <w:tcW w:type="dxa" w:w="2379"/>
           </w:tcPr>
           <w:p>
             <w:r>
@@ -1854,7 +2016,7 @@
         </w:tc>
         <w:tc>
           <w:tcPr>
-            <w:tcW w:type="dxa" w:w="2160"/>
+            <w:tcW w:type="dxa" w:w="2379"/>
           </w:tcPr>
           <w:p>
             <w:r>
@@ -1872,7 +2034,7 @@
         </w:tc>
         <w:tc>
           <w:tcPr>
-            <w:tcW w:type="dxa" w:w="2160"/>
+            <w:tcW w:type="dxa" w:w="2379"/>
           </w:tcPr>
           <w:p>
             <w:r>
@@ -1890,7 +2052,7 @@
         </w:tc>
         <w:tc>
           <w:tcPr>
-            <w:tcW w:type="dxa" w:w="2160"/>
+            <w:tcW w:type="dxa" w:w="2379"/>
           </w:tcPr>
           <w:p>
             <w:r>
@@ -1910,7 +2072,8 @@
       <w:tr>
         <w:tc>
           <w:tcPr>
-            <w:tcW w:type="dxa" w:w="2160"/>
+            <w:tcW w:type="dxa" w:w="2379"/>
+            <w:shd w:val="clear" w:fill="F2F7F7"/>
           </w:tcPr>
           <w:p>
             <w:r>
@@ -1928,7 +2091,8 @@
         </w:tc>
         <w:tc>
           <w:tcPr>
-            <w:tcW w:type="dxa" w:w="2160"/>
+            <w:tcW w:type="dxa" w:w="2379"/>
+            <w:shd w:val="clear" w:fill="F2F7F7"/>
           </w:tcPr>
           <w:p>
             <w:r>
@@ -1946,7 +2110,8 @@
         </w:tc>
         <w:tc>
           <w:tcPr>
-            <w:tcW w:type="dxa" w:w="2160"/>
+            <w:tcW w:type="dxa" w:w="2379"/>
+            <w:shd w:val="clear" w:fill="F2F7F7"/>
           </w:tcPr>
           <w:p>
             <w:r>
@@ -1964,7 +2129,8 @@
         </w:tc>
         <w:tc>
           <w:tcPr>
-            <w:tcW w:type="dxa" w:w="2160"/>
+            <w:tcW w:type="dxa" w:w="2379"/>
+            <w:shd w:val="clear" w:fill="F2F7F7"/>
           </w:tcPr>
           <w:p>
             <w:r>
@@ -1984,7 +2150,7 @@
       <w:tr>
         <w:tc>
           <w:tcPr>
-            <w:tcW w:type="dxa" w:w="2160"/>
+            <w:tcW w:type="dxa" w:w="2379"/>
           </w:tcPr>
           <w:p>
             <w:r>
@@ -2002,7 +2168,7 @@
         </w:tc>
         <w:tc>
           <w:tcPr>
-            <w:tcW w:type="dxa" w:w="2160"/>
+            <w:tcW w:type="dxa" w:w="2379"/>
           </w:tcPr>
           <w:p>
             <w:r>
@@ -2020,7 +2186,7 @@
         </w:tc>
         <w:tc>
           <w:tcPr>
-            <w:tcW w:type="dxa" w:w="2160"/>
+            <w:tcW w:type="dxa" w:w="2379"/>
           </w:tcPr>
           <w:p>
             <w:r>
@@ -2038,7 +2204,7 @@
         </w:tc>
         <w:tc>
           <w:tcPr>
-            <w:tcW w:type="dxa" w:w="2160"/>
+            <w:tcW w:type="dxa" w:w="2379"/>
           </w:tcPr>
           <w:p>
             <w:r>
@@ -2058,7 +2224,8 @@
       <w:tr>
         <w:tc>
           <w:tcPr>
-            <w:tcW w:type="dxa" w:w="2160"/>
+            <w:tcW w:type="dxa" w:w="2379"/>
+            <w:shd w:val="clear" w:fill="F2F7F7"/>
           </w:tcPr>
           <w:p>
             <w:r>
@@ -2076,7 +2243,8 @@
         </w:tc>
         <w:tc>
           <w:tcPr>
-            <w:tcW w:type="dxa" w:w="2160"/>
+            <w:tcW w:type="dxa" w:w="2379"/>
+            <w:shd w:val="clear" w:fill="F2F7F7"/>
           </w:tcPr>
           <w:p>
             <w:r>
@@ -2094,7 +2262,8 @@
         </w:tc>
         <w:tc>
           <w:tcPr>
-            <w:tcW w:type="dxa" w:w="2160"/>
+            <w:tcW w:type="dxa" w:w="2379"/>
+            <w:shd w:val="clear" w:fill="F2F7F7"/>
           </w:tcPr>
           <w:p>
             <w:r>
@@ -2112,7 +2281,8 @@
         </w:tc>
         <w:tc>
           <w:tcPr>
-            <w:tcW w:type="dxa" w:w="2160"/>
+            <w:tcW w:type="dxa" w:w="2379"/>
+            <w:shd w:val="clear" w:fill="F2F7F7"/>
           </w:tcPr>
           <w:p>
             <w:r>
@@ -2132,7 +2302,7 @@
       <w:tr>
         <w:tc>
           <w:tcPr>
-            <w:tcW w:type="dxa" w:w="2160"/>
+            <w:tcW w:type="dxa" w:w="2379"/>
           </w:tcPr>
           <w:p>
             <w:r>
@@ -2150,7 +2320,7 @@
         </w:tc>
         <w:tc>
           <w:tcPr>
-            <w:tcW w:type="dxa" w:w="2160"/>
+            <w:tcW w:type="dxa" w:w="2379"/>
           </w:tcPr>
           <w:p>
             <w:r>
@@ -2168,7 +2338,7 @@
         </w:tc>
         <w:tc>
           <w:tcPr>
-            <w:tcW w:type="dxa" w:w="2160"/>
+            <w:tcW w:type="dxa" w:w="2379"/>
           </w:tcPr>
           <w:p>
             <w:r>
@@ -2186,7 +2356,7 @@
         </w:tc>
         <w:tc>
           <w:tcPr>
-            <w:tcW w:type="dxa" w:w="2160"/>
+            <w:tcW w:type="dxa" w:w="2379"/>
           </w:tcPr>
           <w:p>
             <w:r>
@@ -2206,7 +2376,8 @@
       <w:tr>
         <w:tc>
           <w:tcPr>
-            <w:tcW w:type="dxa" w:w="2160"/>
+            <w:tcW w:type="dxa" w:w="2379"/>
+            <w:shd w:val="clear" w:fill="F2F7F7"/>
           </w:tcPr>
           <w:p>
             <w:r>
@@ -2224,7 +2395,8 @@
         </w:tc>
         <w:tc>
           <w:tcPr>
-            <w:tcW w:type="dxa" w:w="2160"/>
+            <w:tcW w:type="dxa" w:w="2379"/>
+            <w:shd w:val="clear" w:fill="F2F7F7"/>
           </w:tcPr>
           <w:p>
             <w:r>
@@ -2242,7 +2414,8 @@
         </w:tc>
         <w:tc>
           <w:tcPr>
-            <w:tcW w:type="dxa" w:w="2160"/>
+            <w:tcW w:type="dxa" w:w="2379"/>
+            <w:shd w:val="clear" w:fill="F2F7F7"/>
           </w:tcPr>
           <w:p>
             <w:r>
@@ -2260,7 +2433,8 @@
         </w:tc>
         <w:tc>
           <w:tcPr>
-            <w:tcW w:type="dxa" w:w="2160"/>
+            <w:tcW w:type="dxa" w:w="2379"/>
+            <w:shd w:val="clear" w:fill="F2F7F7"/>
           </w:tcPr>
           <w:p>
             <w:r>
@@ -2280,7 +2454,7 @@
       <w:tr>
         <w:tc>
           <w:tcPr>
-            <w:tcW w:type="dxa" w:w="2160"/>
+            <w:tcW w:type="dxa" w:w="2379"/>
           </w:tcPr>
           <w:p>
             <w:r>
@@ -2298,7 +2472,7 @@
         </w:tc>
         <w:tc>
           <w:tcPr>
-            <w:tcW w:type="dxa" w:w="2160"/>
+            <w:tcW w:type="dxa" w:w="2379"/>
           </w:tcPr>
           <w:p>
             <w:r>
@@ -2316,7 +2490,7 @@
         </w:tc>
         <w:tc>
           <w:tcPr>
-            <w:tcW w:type="dxa" w:w="2160"/>
+            <w:tcW w:type="dxa" w:w="2379"/>
           </w:tcPr>
           <w:p>
             <w:r>
@@ -2334,7 +2508,7 @@
         </w:tc>
         <w:tc>
           <w:tcPr>
-            <w:tcW w:type="dxa" w:w="2160"/>
+            <w:tcW w:type="dxa" w:w="2379"/>
           </w:tcPr>
           <w:p>
             <w:r>
@@ -2354,7 +2528,8 @@
       <w:tr>
         <w:tc>
           <w:tcPr>
-            <w:tcW w:type="dxa" w:w="2160"/>
+            <w:tcW w:type="dxa" w:w="2379"/>
+            <w:shd w:val="clear" w:fill="F2F7F7"/>
           </w:tcPr>
           <w:p>
             <w:r>
@@ -2372,7 +2547,8 @@
         </w:tc>
         <w:tc>
           <w:tcPr>
-            <w:tcW w:type="dxa" w:w="2160"/>
+            <w:tcW w:type="dxa" w:w="2379"/>
+            <w:shd w:val="clear" w:fill="F2F7F7"/>
           </w:tcPr>
           <w:p>
             <w:r>
@@ -2390,7 +2566,8 @@
         </w:tc>
         <w:tc>
           <w:tcPr>
-            <w:tcW w:type="dxa" w:w="2160"/>
+            <w:tcW w:type="dxa" w:w="2379"/>
+            <w:shd w:val="clear" w:fill="F2F7F7"/>
           </w:tcPr>
           <w:p>
             <w:r>
@@ -2408,7 +2585,8 @@
         </w:tc>
         <w:tc>
           <w:tcPr>
-            <w:tcW w:type="dxa" w:w="2160"/>
+            <w:tcW w:type="dxa" w:w="2379"/>
+            <w:shd w:val="clear" w:fill="F2F7F7"/>
           </w:tcPr>
           <w:p>
             <w:r>
@@ -2428,7 +2606,7 @@
       <w:tr>
         <w:tc>
           <w:tcPr>
-            <w:tcW w:type="dxa" w:w="2160"/>
+            <w:tcW w:type="dxa" w:w="2379"/>
           </w:tcPr>
           <w:p>
             <w:r>
@@ -2446,7 +2624,7 @@
         </w:tc>
         <w:tc>
           <w:tcPr>
-            <w:tcW w:type="dxa" w:w="2160"/>
+            <w:tcW w:type="dxa" w:w="2379"/>
           </w:tcPr>
           <w:p>
             <w:r>
@@ -2464,7 +2642,7 @@
         </w:tc>
         <w:tc>
           <w:tcPr>
-            <w:tcW w:type="dxa" w:w="2160"/>
+            <w:tcW w:type="dxa" w:w="2379"/>
           </w:tcPr>
           <w:p>
             <w:r>
@@ -2482,7 +2660,7 @@
         </w:tc>
         <w:tc>
           <w:tcPr>
-            <w:tcW w:type="dxa" w:w="2160"/>
+            <w:tcW w:type="dxa" w:w="2379"/>
           </w:tcPr>
           <w:p>
             <w:r>
@@ -2502,7 +2680,8 @@
       <w:tr>
         <w:tc>
           <w:tcPr>
-            <w:tcW w:type="dxa" w:w="2160"/>
+            <w:tcW w:type="dxa" w:w="2379"/>
+            <w:shd w:val="clear" w:fill="F2F7F7"/>
           </w:tcPr>
           <w:p>
             <w:r>
@@ -2520,7 +2699,8 @@
         </w:tc>
         <w:tc>
           <w:tcPr>
-            <w:tcW w:type="dxa" w:w="2160"/>
+            <w:tcW w:type="dxa" w:w="2379"/>
+            <w:shd w:val="clear" w:fill="F2F7F7"/>
           </w:tcPr>
           <w:p>
             <w:r>
@@ -2538,7 +2718,8 @@
         </w:tc>
         <w:tc>
           <w:tcPr>
-            <w:tcW w:type="dxa" w:w="2160"/>
+            <w:tcW w:type="dxa" w:w="2379"/>
+            <w:shd w:val="clear" w:fill="F2F7F7"/>
           </w:tcPr>
           <w:p>
             <w:r>
@@ -2556,7 +2737,8 @@
         </w:tc>
         <w:tc>
           <w:tcPr>
-            <w:tcW w:type="dxa" w:w="2160"/>
+            <w:tcW w:type="dxa" w:w="2379"/>
+            <w:shd w:val="clear" w:fill="F2F7F7"/>
           </w:tcPr>
           <w:p>
             <w:r>
@@ -2576,7 +2758,7 @@
       <w:tr>
         <w:tc>
           <w:tcPr>
-            <w:tcW w:type="dxa" w:w="2160"/>
+            <w:tcW w:type="dxa" w:w="2379"/>
           </w:tcPr>
           <w:p>
             <w:r>
@@ -2594,7 +2776,7 @@
         </w:tc>
         <w:tc>
           <w:tcPr>
-            <w:tcW w:type="dxa" w:w="2160"/>
+            <w:tcW w:type="dxa" w:w="2379"/>
           </w:tcPr>
           <w:p>
             <w:r>
@@ -2612,7 +2794,7 @@
         </w:tc>
         <w:tc>
           <w:tcPr>
-            <w:tcW w:type="dxa" w:w="2160"/>
+            <w:tcW w:type="dxa" w:w="2379"/>
           </w:tcPr>
           <w:p>
             <w:r>
@@ -2630,7 +2812,7 @@
         </w:tc>
         <w:tc>
           <w:tcPr>
-            <w:tcW w:type="dxa" w:w="2160"/>
+            <w:tcW w:type="dxa" w:w="2379"/>
           </w:tcPr>
           <w:p>
             <w:r>
@@ -2650,7 +2832,8 @@
       <w:tr>
         <w:tc>
           <w:tcPr>
-            <w:tcW w:type="dxa" w:w="2160"/>
+            <w:tcW w:type="dxa" w:w="2379"/>
+            <w:shd w:val="clear" w:fill="F2F7F7"/>
           </w:tcPr>
           <w:p>
             <w:r>
@@ -2668,7 +2851,8 @@
         </w:tc>
         <w:tc>
           <w:tcPr>
-            <w:tcW w:type="dxa" w:w="2160"/>
+            <w:tcW w:type="dxa" w:w="2379"/>
+            <w:shd w:val="clear" w:fill="F2F7F7"/>
           </w:tcPr>
           <w:p>
             <w:r>
@@ -2686,7 +2870,8 @@
         </w:tc>
         <w:tc>
           <w:tcPr>
-            <w:tcW w:type="dxa" w:w="2160"/>
+            <w:tcW w:type="dxa" w:w="2379"/>
+            <w:shd w:val="clear" w:fill="F2F7F7"/>
           </w:tcPr>
           <w:p>
             <w:r>
@@ -2704,7 +2889,8 @@
         </w:tc>
         <w:tc>
           <w:tcPr>
-            <w:tcW w:type="dxa" w:w="2160"/>
+            <w:tcW w:type="dxa" w:w="2379"/>
+            <w:shd w:val="clear" w:fill="F2F7F7"/>
           </w:tcPr>
           <w:p>
             <w:r>
@@ -2724,7 +2910,7 @@
       <w:tr>
         <w:tc>
           <w:tcPr>
-            <w:tcW w:type="dxa" w:w="2160"/>
+            <w:tcW w:type="dxa" w:w="2379"/>
           </w:tcPr>
           <w:p>
             <w:r>
@@ -2742,7 +2928,7 @@
         </w:tc>
         <w:tc>
           <w:tcPr>
-            <w:tcW w:type="dxa" w:w="2160"/>
+            <w:tcW w:type="dxa" w:w="2379"/>
           </w:tcPr>
           <w:p>
             <w:r>
@@ -2760,7 +2946,7 @@
         </w:tc>
         <w:tc>
           <w:tcPr>
-            <w:tcW w:type="dxa" w:w="2160"/>
+            <w:tcW w:type="dxa" w:w="2379"/>
           </w:tcPr>
           <w:p>
             <w:r>
@@ -2778,7 +2964,7 @@
         </w:tc>
         <w:tc>
           <w:tcPr>
-            <w:tcW w:type="dxa" w:w="2160"/>
+            <w:tcW w:type="dxa" w:w="2379"/>
           </w:tcPr>
           <w:p>
             <w:r>
@@ -2798,7 +2984,8 @@
       <w:tr>
         <w:tc>
           <w:tcPr>
-            <w:tcW w:type="dxa" w:w="2160"/>
+            <w:tcW w:type="dxa" w:w="2379"/>
+            <w:shd w:val="clear" w:fill="F2F7F7"/>
           </w:tcPr>
           <w:p>
             <w:r>
@@ -2816,7 +3003,8 @@
         </w:tc>
         <w:tc>
           <w:tcPr>
-            <w:tcW w:type="dxa" w:w="2160"/>
+            <w:tcW w:type="dxa" w:w="2379"/>
+            <w:shd w:val="clear" w:fill="F2F7F7"/>
           </w:tcPr>
           <w:p>
             <w:r>
@@ -2834,7 +3022,8 @@
         </w:tc>
         <w:tc>
           <w:tcPr>
-            <w:tcW w:type="dxa" w:w="2160"/>
+            <w:tcW w:type="dxa" w:w="2379"/>
+            <w:shd w:val="clear" w:fill="F2F7F7"/>
           </w:tcPr>
           <w:p>
             <w:r>
@@ -2852,7 +3041,8 @@
         </w:tc>
         <w:tc>
           <w:tcPr>
-            <w:tcW w:type="dxa" w:w="2160"/>
+            <w:tcW w:type="dxa" w:w="2379"/>
+            <w:shd w:val="clear" w:fill="F2F7F7"/>
           </w:tcPr>
           <w:p>
             <w:r>
@@ -2872,7 +3062,7 @@
       <w:tr>
         <w:tc>
           <w:tcPr>
-            <w:tcW w:type="dxa" w:w="2160"/>
+            <w:tcW w:type="dxa" w:w="2379"/>
           </w:tcPr>
           <w:p>
             <w:r>
@@ -2890,7 +3080,7 @@
         </w:tc>
         <w:tc>
           <w:tcPr>
-            <w:tcW w:type="dxa" w:w="2160"/>
+            <w:tcW w:type="dxa" w:w="2379"/>
           </w:tcPr>
           <w:p>
             <w:r>
@@ -2908,7 +3098,7 @@
         </w:tc>
         <w:tc>
           <w:tcPr>
-            <w:tcW w:type="dxa" w:w="2160"/>
+            <w:tcW w:type="dxa" w:w="2379"/>
           </w:tcPr>
           <w:p>
             <w:r>
@@ -2926,7 +3116,7 @@
         </w:tc>
         <w:tc>
           <w:tcPr>
-            <w:tcW w:type="dxa" w:w="2160"/>
+            <w:tcW w:type="dxa" w:w="2379"/>
           </w:tcPr>
           <w:p>
             <w:r>
@@ -2946,7 +3136,8 @@
       <w:tr>
         <w:tc>
           <w:tcPr>
-            <w:tcW w:type="dxa" w:w="2160"/>
+            <w:tcW w:type="dxa" w:w="2379"/>
+            <w:shd w:val="clear" w:fill="F2F7F7"/>
           </w:tcPr>
           <w:p>
             <w:r>
@@ -2964,7 +3155,8 @@
         </w:tc>
         <w:tc>
           <w:tcPr>
-            <w:tcW w:type="dxa" w:w="2160"/>
+            <w:tcW w:type="dxa" w:w="2379"/>
+            <w:shd w:val="clear" w:fill="F2F7F7"/>
           </w:tcPr>
           <w:p>
             <w:r>
@@ -2982,7 +3174,8 @@
         </w:tc>
         <w:tc>
           <w:tcPr>
-            <w:tcW w:type="dxa" w:w="2160"/>
+            <w:tcW w:type="dxa" w:w="2379"/>
+            <w:shd w:val="clear" w:fill="F2F7F7"/>
           </w:tcPr>
           <w:p>
             <w:r>
@@ -3000,7 +3193,8 @@
         </w:tc>
         <w:tc>
           <w:tcPr>
-            <w:tcW w:type="dxa" w:w="2160"/>
+            <w:tcW w:type="dxa" w:w="2379"/>
+            <w:shd w:val="clear" w:fill="F2F7F7"/>
           </w:tcPr>
           <w:p>
             <w:r>
@@ -3020,7 +3214,7 @@
       <w:tr>
         <w:tc>
           <w:tcPr>
-            <w:tcW w:type="dxa" w:w="2160"/>
+            <w:tcW w:type="dxa" w:w="2379"/>
           </w:tcPr>
           <w:p>
             <w:r>
@@ -3038,7 +3232,7 @@
         </w:tc>
         <w:tc>
           <w:tcPr>
-            <w:tcW w:type="dxa" w:w="2160"/>
+            <w:tcW w:type="dxa" w:w="2379"/>
           </w:tcPr>
           <w:p>
             <w:r>
@@ -3056,7 +3250,7 @@
         </w:tc>
         <w:tc>
           <w:tcPr>
-            <w:tcW w:type="dxa" w:w="2160"/>
+            <w:tcW w:type="dxa" w:w="2379"/>
           </w:tcPr>
           <w:p>
             <w:r>
@@ -3074,7 +3268,7 @@
         </w:tc>
         <w:tc>
           <w:tcPr>
-            <w:tcW w:type="dxa" w:w="2160"/>
+            <w:tcW w:type="dxa" w:w="2379"/>
           </w:tcPr>
           <w:p>
             <w:r>
@@ -3094,7 +3288,8 @@
       <w:tr>
         <w:tc>
           <w:tcPr>
-            <w:tcW w:type="dxa" w:w="2160"/>
+            <w:tcW w:type="dxa" w:w="2379"/>
+            <w:shd w:val="clear" w:fill="F2F7F7"/>
           </w:tcPr>
           <w:p>
             <w:r>
@@ -3112,7 +3307,8 @@
         </w:tc>
         <w:tc>
           <w:tcPr>
-            <w:tcW w:type="dxa" w:w="2160"/>
+            <w:tcW w:type="dxa" w:w="2379"/>
+            <w:shd w:val="clear" w:fill="F2F7F7"/>
           </w:tcPr>
           <w:p>
             <w:r>
@@ -3130,7 +3326,8 @@
         </w:tc>
         <w:tc>
           <w:tcPr>
-            <w:tcW w:type="dxa" w:w="2160"/>
+            <w:tcW w:type="dxa" w:w="2379"/>
+            <w:shd w:val="clear" w:fill="F2F7F7"/>
           </w:tcPr>
           <w:p>
             <w:r>
@@ -3148,7 +3345,8 @@
         </w:tc>
         <w:tc>
           <w:tcPr>
-            <w:tcW w:type="dxa" w:w="2160"/>
+            <w:tcW w:type="dxa" w:w="2379"/>
+            <w:shd w:val="clear" w:fill="F2F7F7"/>
           </w:tcPr>
           <w:p>
             <w:r>
@@ -3168,7 +3366,7 @@
       <w:tr>
         <w:tc>
           <w:tcPr>
-            <w:tcW w:type="dxa" w:w="2160"/>
+            <w:tcW w:type="dxa" w:w="2379"/>
           </w:tcPr>
           <w:p>
             <w:r>
@@ -3186,7 +3384,7 @@
         </w:tc>
         <w:tc>
           <w:tcPr>
-            <w:tcW w:type="dxa" w:w="2160"/>
+            <w:tcW w:type="dxa" w:w="2379"/>
           </w:tcPr>
           <w:p>
             <w:r>
@@ -3204,7 +3402,7 @@
         </w:tc>
         <w:tc>
           <w:tcPr>
-            <w:tcW w:type="dxa" w:w="2160"/>
+            <w:tcW w:type="dxa" w:w="2379"/>
           </w:tcPr>
           <w:p>
             <w:r>
@@ -3222,7 +3420,7 @@
         </w:tc>
         <w:tc>
           <w:tcPr>
-            <w:tcW w:type="dxa" w:w="2160"/>
+            <w:tcW w:type="dxa" w:w="2379"/>
           </w:tcPr>
           <w:p>
             <w:r>
@@ -3242,7 +3440,8 @@
       <w:tr>
         <w:tc>
           <w:tcPr>
-            <w:tcW w:type="dxa" w:w="2160"/>
+            <w:tcW w:type="dxa" w:w="2379"/>
+            <w:shd w:val="clear" w:fill="F2F7F7"/>
           </w:tcPr>
           <w:p>
             <w:r>
@@ -3260,7 +3459,8 @@
         </w:tc>
         <w:tc>
           <w:tcPr>
-            <w:tcW w:type="dxa" w:w="2160"/>
+            <w:tcW w:type="dxa" w:w="2379"/>
+            <w:shd w:val="clear" w:fill="F2F7F7"/>
           </w:tcPr>
           <w:p>
             <w:r>
@@ -3278,7 +3478,8 @@
         </w:tc>
         <w:tc>
           <w:tcPr>
-            <w:tcW w:type="dxa" w:w="2160"/>
+            <w:tcW w:type="dxa" w:w="2379"/>
+            <w:shd w:val="clear" w:fill="F2F7F7"/>
           </w:tcPr>
           <w:p>
             <w:r>
@@ -3296,7 +3497,8 @@
         </w:tc>
         <w:tc>
           <w:tcPr>
-            <w:tcW w:type="dxa" w:w="2160"/>
+            <w:tcW w:type="dxa" w:w="2379"/>
+            <w:shd w:val="clear" w:fill="F2F7F7"/>
           </w:tcPr>
           <w:p>
             <w:r>
@@ -3316,7 +3518,7 @@
       <w:tr>
         <w:tc>
           <w:tcPr>
-            <w:tcW w:type="dxa" w:w="2160"/>
+            <w:tcW w:type="dxa" w:w="2379"/>
           </w:tcPr>
           <w:p>
             <w:r>
@@ -3334,7 +3536,7 @@
         </w:tc>
         <w:tc>
           <w:tcPr>
-            <w:tcW w:type="dxa" w:w="2160"/>
+            <w:tcW w:type="dxa" w:w="2379"/>
           </w:tcPr>
           <w:p>
             <w:r>
@@ -3352,7 +3554,7 @@
         </w:tc>
         <w:tc>
           <w:tcPr>
-            <w:tcW w:type="dxa" w:w="2160"/>
+            <w:tcW w:type="dxa" w:w="2379"/>
           </w:tcPr>
           <w:p>
             <w:r>
@@ -3370,7 +3572,7 @@
         </w:tc>
         <w:tc>
           <w:tcPr>
-            <w:tcW w:type="dxa" w:w="2160"/>
+            <w:tcW w:type="dxa" w:w="2379"/>
           </w:tcPr>
           <w:p>
             <w:r>
@@ -3390,7 +3592,8 @@
       <w:tr>
         <w:tc>
           <w:tcPr>
-            <w:tcW w:type="dxa" w:w="2160"/>
+            <w:tcW w:type="dxa" w:w="2379"/>
+            <w:shd w:val="clear" w:fill="F2F7F7"/>
           </w:tcPr>
           <w:p>
             <w:r>
@@ -3408,7 +3611,8 @@
         </w:tc>
         <w:tc>
           <w:tcPr>
-            <w:tcW w:type="dxa" w:w="2160"/>
+            <w:tcW w:type="dxa" w:w="2379"/>
+            <w:shd w:val="clear" w:fill="F2F7F7"/>
           </w:tcPr>
           <w:p>
             <w:r>
@@ -3426,7 +3630,8 @@
         </w:tc>
         <w:tc>
           <w:tcPr>
-            <w:tcW w:type="dxa" w:w="2160"/>
+            <w:tcW w:type="dxa" w:w="2379"/>
+            <w:shd w:val="clear" w:fill="F2F7F7"/>
           </w:tcPr>
           <w:p>
             <w:r>
@@ -3444,7 +3649,8 @@
         </w:tc>
         <w:tc>
           <w:tcPr>
-            <w:tcW w:type="dxa" w:w="2160"/>
+            <w:tcW w:type="dxa" w:w="2379"/>
+            <w:shd w:val="clear" w:fill="F2F7F7"/>
           </w:tcPr>
           <w:p>
             <w:r>
@@ -3464,7 +3670,7 @@
       <w:tr>
         <w:tc>
           <w:tcPr>
-            <w:tcW w:type="dxa" w:w="2160"/>
+            <w:tcW w:type="dxa" w:w="2379"/>
           </w:tcPr>
           <w:p>
             <w:r>
@@ -3482,7 +3688,7 @@
         </w:tc>
         <w:tc>
           <w:tcPr>
-            <w:tcW w:type="dxa" w:w="2160"/>
+            <w:tcW w:type="dxa" w:w="2379"/>
           </w:tcPr>
           <w:p>
             <w:r>
@@ -3500,7 +3706,7 @@
         </w:tc>
         <w:tc>
           <w:tcPr>
-            <w:tcW w:type="dxa" w:w="2160"/>
+            <w:tcW w:type="dxa" w:w="2379"/>
           </w:tcPr>
           <w:p>
             <w:r>
@@ -3518,7 +3724,7 @@
         </w:tc>
         <w:tc>
           <w:tcPr>
-            <w:tcW w:type="dxa" w:w="2160"/>
+            <w:tcW w:type="dxa" w:w="2379"/>
           </w:tcPr>
           <w:p>
             <w:r>
@@ -3538,7 +3744,8 @@
       <w:tr>
         <w:tc>
           <w:tcPr>
-            <w:tcW w:type="dxa" w:w="2160"/>
+            <w:tcW w:type="dxa" w:w="2379"/>
+            <w:shd w:val="clear" w:fill="F2F7F7"/>
           </w:tcPr>
           <w:p>
             <w:r>
@@ -3556,7 +3763,8 @@
         </w:tc>
         <w:tc>
           <w:tcPr>
-            <w:tcW w:type="dxa" w:w="2160"/>
+            <w:tcW w:type="dxa" w:w="2379"/>
+            <w:shd w:val="clear" w:fill="F2F7F7"/>
           </w:tcPr>
           <w:p>
             <w:r>
@@ -3574,7 +3782,8 @@
         </w:tc>
         <w:tc>
           <w:tcPr>
-            <w:tcW w:type="dxa" w:w="2160"/>
+            <w:tcW w:type="dxa" w:w="2379"/>
+            <w:shd w:val="clear" w:fill="F2F7F7"/>
           </w:tcPr>
           <w:p>
             <w:r>
@@ -3592,7 +3801,8 @@
         </w:tc>
         <w:tc>
           <w:tcPr>
-            <w:tcW w:type="dxa" w:w="2160"/>
+            <w:tcW w:type="dxa" w:w="2379"/>
+            <w:shd w:val="clear" w:fill="F2F7F7"/>
           </w:tcPr>
           <w:p>
             <w:r>
@@ -3612,7 +3822,7 @@
       <w:tr>
         <w:tc>
           <w:tcPr>
-            <w:tcW w:type="dxa" w:w="2160"/>
+            <w:tcW w:type="dxa" w:w="2379"/>
           </w:tcPr>
           <w:p>
             <w:r>
@@ -3630,7 +3840,7 @@
         </w:tc>
         <w:tc>
           <w:tcPr>
-            <w:tcW w:type="dxa" w:w="2160"/>
+            <w:tcW w:type="dxa" w:w="2379"/>
           </w:tcPr>
           <w:p>
             <w:r>
@@ -3648,7 +3858,7 @@
         </w:tc>
         <w:tc>
           <w:tcPr>
-            <w:tcW w:type="dxa" w:w="2160"/>
+            <w:tcW w:type="dxa" w:w="2379"/>
           </w:tcPr>
           <w:p>
             <w:r>
@@ -3666,7 +3876,7 @@
         </w:tc>
         <w:tc>
           <w:tcPr>
-            <w:tcW w:type="dxa" w:w="2160"/>
+            <w:tcW w:type="dxa" w:w="2379"/>
           </w:tcPr>
           <w:p>
             <w:r>
@@ -3686,7 +3896,8 @@
       <w:tr>
         <w:tc>
           <w:tcPr>
-            <w:tcW w:type="dxa" w:w="2160"/>
+            <w:tcW w:type="dxa" w:w="2379"/>
+            <w:shd w:val="clear" w:fill="F2F7F7"/>
           </w:tcPr>
           <w:p>
             <w:r>
@@ -3704,7 +3915,8 @@
         </w:tc>
         <w:tc>
           <w:tcPr>
-            <w:tcW w:type="dxa" w:w="2160"/>
+            <w:tcW w:type="dxa" w:w="2379"/>
+            <w:shd w:val="clear" w:fill="F2F7F7"/>
           </w:tcPr>
           <w:p>
             <w:r>
@@ -3722,7 +3934,8 @@
         </w:tc>
         <w:tc>
           <w:tcPr>
-            <w:tcW w:type="dxa" w:w="2160"/>
+            <w:tcW w:type="dxa" w:w="2379"/>
+            <w:shd w:val="clear" w:fill="F2F7F7"/>
           </w:tcPr>
           <w:p>
             <w:r>
@@ -3740,7 +3953,8 @@
         </w:tc>
         <w:tc>
           <w:tcPr>
-            <w:tcW w:type="dxa" w:w="2160"/>
+            <w:tcW w:type="dxa" w:w="2379"/>
+            <w:shd w:val="clear" w:fill="F2F7F7"/>
           </w:tcPr>
           <w:p>
             <w:r>
@@ -3760,7 +3974,7 @@
       <w:tr>
         <w:tc>
           <w:tcPr>
-            <w:tcW w:type="dxa" w:w="2160"/>
+            <w:tcW w:type="dxa" w:w="2379"/>
           </w:tcPr>
           <w:p>
             <w:r>
@@ -3778,7 +3992,7 @@
         </w:tc>
         <w:tc>
           <w:tcPr>
-            <w:tcW w:type="dxa" w:w="2160"/>
+            <w:tcW w:type="dxa" w:w="2379"/>
           </w:tcPr>
           <w:p>
             <w:r>
@@ -3796,7 +4010,7 @@
         </w:tc>
         <w:tc>
           <w:tcPr>
-            <w:tcW w:type="dxa" w:w="2160"/>
+            <w:tcW w:type="dxa" w:w="2379"/>
           </w:tcPr>
           <w:p>
             <w:r>
@@ -3814,7 +4028,7 @@
         </w:tc>
         <w:tc>
           <w:tcPr>
-            <w:tcW w:type="dxa" w:w="2160"/>
+            <w:tcW w:type="dxa" w:w="2379"/>
           </w:tcPr>
           <w:p>
             <w:r>
@@ -3834,7 +4048,8 @@
       <w:tr>
         <w:tc>
           <w:tcPr>
-            <w:tcW w:type="dxa" w:w="2160"/>
+            <w:tcW w:type="dxa" w:w="2379"/>
+            <w:shd w:val="clear" w:fill="F2F7F7"/>
           </w:tcPr>
           <w:p>
             <w:r>
@@ -3852,7 +4067,8 @@
         </w:tc>
         <w:tc>
           <w:tcPr>
-            <w:tcW w:type="dxa" w:w="2160"/>
+            <w:tcW w:type="dxa" w:w="2379"/>
+            <w:shd w:val="clear" w:fill="F2F7F7"/>
           </w:tcPr>
           <w:p>
             <w:r>
@@ -3870,7 +4086,8 @@
         </w:tc>
         <w:tc>
           <w:tcPr>
-            <w:tcW w:type="dxa" w:w="2160"/>
+            <w:tcW w:type="dxa" w:w="2379"/>
+            <w:shd w:val="clear" w:fill="F2F7F7"/>
           </w:tcPr>
           <w:p>
             <w:r>
@@ -3888,7 +4105,8 @@
         </w:tc>
         <w:tc>
           <w:tcPr>
-            <w:tcW w:type="dxa" w:w="2160"/>
+            <w:tcW w:type="dxa" w:w="2379"/>
+            <w:shd w:val="clear" w:fill="F2F7F7"/>
           </w:tcPr>
           <w:p>
             <w:r>
@@ -3908,7 +4126,7 @@
       <w:tr>
         <w:tc>
           <w:tcPr>
-            <w:tcW w:type="dxa" w:w="2160"/>
+            <w:tcW w:type="dxa" w:w="2379"/>
           </w:tcPr>
           <w:p>
             <w:r>
@@ -3926,7 +4144,7 @@
         </w:tc>
         <w:tc>
           <w:tcPr>
-            <w:tcW w:type="dxa" w:w="2160"/>
+            <w:tcW w:type="dxa" w:w="2379"/>
           </w:tcPr>
           <w:p>
             <w:r>
@@ -3944,7 +4162,7 @@
         </w:tc>
         <w:tc>
           <w:tcPr>
-            <w:tcW w:type="dxa" w:w="2160"/>
+            <w:tcW w:type="dxa" w:w="2379"/>
           </w:tcPr>
           <w:p>
             <w:r>
@@ -3962,7 +4180,7 @@
         </w:tc>
         <w:tc>
           <w:tcPr>
-            <w:tcW w:type="dxa" w:w="2160"/>
+            <w:tcW w:type="dxa" w:w="2379"/>
           </w:tcPr>
           <w:p>
             <w:r>
@@ -3982,7 +4200,8 @@
       <w:tr>
         <w:tc>
           <w:tcPr>
-            <w:tcW w:type="dxa" w:w="2160"/>
+            <w:tcW w:type="dxa" w:w="2379"/>
+            <w:shd w:val="clear" w:fill="F2F7F7"/>
           </w:tcPr>
           <w:p>
             <w:r>
@@ -4000,7 +4219,8 @@
         </w:tc>
         <w:tc>
           <w:tcPr>
-            <w:tcW w:type="dxa" w:w="2160"/>
+            <w:tcW w:type="dxa" w:w="2379"/>
+            <w:shd w:val="clear" w:fill="F2F7F7"/>
           </w:tcPr>
           <w:p>
             <w:r>
@@ -4018,7 +4238,8 @@
         </w:tc>
         <w:tc>
           <w:tcPr>
-            <w:tcW w:type="dxa" w:w="2160"/>
+            <w:tcW w:type="dxa" w:w="2379"/>
+            <w:shd w:val="clear" w:fill="F2F7F7"/>
           </w:tcPr>
           <w:p>
             <w:r>
@@ -4036,7 +4257,8 @@
         </w:tc>
         <w:tc>
           <w:tcPr>
-            <w:tcW w:type="dxa" w:w="2160"/>
+            <w:tcW w:type="dxa" w:w="2379"/>
+            <w:shd w:val="clear" w:fill="F2F7F7"/>
           </w:tcPr>
           <w:p>
             <w:r>
@@ -4056,7 +4278,7 @@
       <w:tr>
         <w:tc>
           <w:tcPr>
-            <w:tcW w:type="dxa" w:w="2160"/>
+            <w:tcW w:type="dxa" w:w="2379"/>
           </w:tcPr>
           <w:p>
             <w:r>
@@ -4074,7 +4296,7 @@
         </w:tc>
         <w:tc>
           <w:tcPr>
-            <w:tcW w:type="dxa" w:w="2160"/>
+            <w:tcW w:type="dxa" w:w="2379"/>
           </w:tcPr>
           <w:p>
             <w:r>
@@ -4092,7 +4314,7 @@
         </w:tc>
         <w:tc>
           <w:tcPr>
-            <w:tcW w:type="dxa" w:w="2160"/>
+            <w:tcW w:type="dxa" w:w="2379"/>
           </w:tcPr>
           <w:p>
             <w:r>
@@ -4110,7 +4332,7 @@
         </w:tc>
         <w:tc>
           <w:tcPr>
-            <w:tcW w:type="dxa" w:w="2160"/>
+            <w:tcW w:type="dxa" w:w="2379"/>
           </w:tcPr>
           <w:p>
             <w:r>
@@ -4130,7 +4352,8 @@
       <w:tr>
         <w:tc>
           <w:tcPr>
-            <w:tcW w:type="dxa" w:w="2160"/>
+            <w:tcW w:type="dxa" w:w="2379"/>
+            <w:shd w:val="clear" w:fill="F2F7F7"/>
           </w:tcPr>
           <w:p>
             <w:r>
@@ -4148,7 +4371,8 @@
         </w:tc>
         <w:tc>
           <w:tcPr>
-            <w:tcW w:type="dxa" w:w="2160"/>
+            <w:tcW w:type="dxa" w:w="2379"/>
+            <w:shd w:val="clear" w:fill="F2F7F7"/>
           </w:tcPr>
           <w:p>
             <w:r>
@@ -4166,7 +4390,8 @@
         </w:tc>
         <w:tc>
           <w:tcPr>
-            <w:tcW w:type="dxa" w:w="2160"/>
+            <w:tcW w:type="dxa" w:w="2379"/>
+            <w:shd w:val="clear" w:fill="F2F7F7"/>
           </w:tcPr>
           <w:p>
             <w:r>
@@ -4184,7 +4409,8 @@
         </w:tc>
         <w:tc>
           <w:tcPr>
-            <w:tcW w:type="dxa" w:w="2160"/>
+            <w:tcW w:type="dxa" w:w="2379"/>
+            <w:shd w:val="clear" w:fill="F2F7F7"/>
           </w:tcPr>
           <w:p>
             <w:r>
@@ -4204,7 +4430,7 @@
       <w:tr>
         <w:tc>
           <w:tcPr>
-            <w:tcW w:type="dxa" w:w="2160"/>
+            <w:tcW w:type="dxa" w:w="2379"/>
           </w:tcPr>
           <w:p>
             <w:r>
@@ -4222,7 +4448,7 @@
         </w:tc>
         <w:tc>
           <w:tcPr>
-            <w:tcW w:type="dxa" w:w="2160"/>
+            <w:tcW w:type="dxa" w:w="2379"/>
           </w:tcPr>
           <w:p>
             <w:r>
@@ -4240,7 +4466,7 @@
         </w:tc>
         <w:tc>
           <w:tcPr>
-            <w:tcW w:type="dxa" w:w="2160"/>
+            <w:tcW w:type="dxa" w:w="2379"/>
           </w:tcPr>
           <w:p>
             <w:r>
@@ -4258,7 +4484,7 @@
         </w:tc>
         <w:tc>
           <w:tcPr>
-            <w:tcW w:type="dxa" w:w="2160"/>
+            <w:tcW w:type="dxa" w:w="2379"/>
           </w:tcPr>
           <w:p>
             <w:r>
@@ -4278,7 +4504,8 @@
       <w:tr>
         <w:tc>
           <w:tcPr>
-            <w:tcW w:type="dxa" w:w="2160"/>
+            <w:tcW w:type="dxa" w:w="2379"/>
+            <w:shd w:val="clear" w:fill="F2F7F7"/>
           </w:tcPr>
           <w:p>
             <w:r>
@@ -4296,7 +4523,8 @@
         </w:tc>
         <w:tc>
           <w:tcPr>
-            <w:tcW w:type="dxa" w:w="2160"/>
+            <w:tcW w:type="dxa" w:w="2379"/>
+            <w:shd w:val="clear" w:fill="F2F7F7"/>
           </w:tcPr>
           <w:p>
             <w:r>
@@ -4314,7 +4542,8 @@
         </w:tc>
         <w:tc>
           <w:tcPr>
-            <w:tcW w:type="dxa" w:w="2160"/>
+            <w:tcW w:type="dxa" w:w="2379"/>
+            <w:shd w:val="clear" w:fill="F2F7F7"/>
           </w:tcPr>
           <w:p>
             <w:r>
@@ -4332,7 +4561,8 @@
         </w:tc>
         <w:tc>
           <w:tcPr>
-            <w:tcW w:type="dxa" w:w="2160"/>
+            <w:tcW w:type="dxa" w:w="2379"/>
+            <w:shd w:val="clear" w:fill="F2F7F7"/>
           </w:tcPr>
           <w:p>
             <w:r>
@@ -4352,7 +4582,7 @@
       <w:tr>
         <w:tc>
           <w:tcPr>
-            <w:tcW w:type="dxa" w:w="2160"/>
+            <w:tcW w:type="dxa" w:w="2379"/>
           </w:tcPr>
           <w:p>
             <w:r>
@@ -4370,7 +4600,7 @@
         </w:tc>
         <w:tc>
           <w:tcPr>
-            <w:tcW w:type="dxa" w:w="2160"/>
+            <w:tcW w:type="dxa" w:w="2379"/>
           </w:tcPr>
           <w:p>
             <w:r>
@@ -4388,7 +4618,7 @@
         </w:tc>
         <w:tc>
           <w:tcPr>
-            <w:tcW w:type="dxa" w:w="2160"/>
+            <w:tcW w:type="dxa" w:w="2379"/>
           </w:tcPr>
           <w:p>
             <w:r>
@@ -4406,7 +4636,7 @@
         </w:tc>
         <w:tc>
           <w:tcPr>
-            <w:tcW w:type="dxa" w:w="2160"/>
+            <w:tcW w:type="dxa" w:w="2379"/>
           </w:tcPr>
           <w:p>
             <w:r>
@@ -4428,10 +4658,14 @@
     <w:p>
       <w:pPr>
         <w:pStyle w:val="Heading2"/>
+        <w:spacing w:before="320" w:after="120"/>
       </w:pPr>
       <w:r>
         <w:rPr>
-          <w:color w:val="1F2937"/>
+          <w:rFonts w:ascii="Calibri" w:hAnsi="Calibri"/>
+          <w:b/>
+          <w:color w:val="008490"/>
+          <w:sz w:val="31"/>
         </w:rPr>
         <w:t>Reading the totals</w:t>
       </w:r>
@@ -4507,13 +4741,76 @@
       </w:r>
     </w:p>
     <w:sectPr>
+      <w:footerReference w:type="default" r:id="rId9"/>
       <w:pgSz w:w="12240" w:h="15840"/>
-      <w:pgMar w:top="1440" w:right="1800" w:bottom="1440" w:left="1800" w:header="720" w:footer="720" w:gutter="0"/>
+      <w:pgMar w:top="1247" w:right="1361" w:bottom="1134" w:left="1361" w:header="720" w:footer="720" w:gutter="0"/>
       <w:cols w:space="720"/>
       <w:docGrid w:linePitch="360"/>
     </w:sectPr>
   </w:body>
 </w:document>
+</file>
+
+<file path=word/footer1.xml><?xml version="1.0" encoding="utf-8"?>
+<w:ftr xmlns:m="http://schemas.openxmlformats.org/officeDocument/2006/math" xmlns:mc="http://schemas.openxmlformats.org/markup-compatibility/2006" xmlns:mo="http://schemas.microsoft.com/office/mac/office/2008/main" xmlns:mv="urn:schemas-microsoft-com:mac:vml" xmlns:o="urn:schemas-microsoft-com:office:office" xmlns:r="http://schemas.openxmlformats.org/officeDocument/2006/relationships" xmlns:v="urn:schemas-microsoft-com:vml" xmlns:w10="urn:schemas-microsoft-com:office:word" xmlns:w14="http://schemas.microsoft.com/office/word/2010/wordml" xmlns:w="http://schemas.openxmlformats.org/wordprocessingml/2006/main" xmlns:wne="http://schemas.microsoft.com/office/word/2006/wordml" xmlns:wp14="http://schemas.microsoft.com/office/word/2010/wordprocessingDrawing" xmlns:wp="http://schemas.openxmlformats.org/drawingml/2006/wordprocessingDrawing" xmlns:wpc="http://schemas.microsoft.com/office/word/2010/wordprocessingCanvas" xmlns:wpg="http://schemas.microsoft.com/office/word/2010/wordprocessingGroup" xmlns:wpi="http://schemas.microsoft.com/office/word/2010/wordprocessingInk" xmlns:wps="http://schemas.microsoft.com/office/word/2010/wordprocessingShape" mc:Ignorable="w14 wp14">
+  <w:p>
+    <w:pPr>
+      <w:pStyle w:val="Footer"/>
+      <w:tabs>
+        <w:tab w:pos="9518" w:val="right"/>
+      </w:tabs>
+      <w:pBdr>
+        <w:top w:val="single" w:sz="4" w:space="6" w:color="008490"/>
+      </w:pBdr>
+    </w:pPr>
+    <w:r/>
+    <w:r>
+      <w:rPr>
+        <w:color w:val="6B7280"/>
+        <w:sz w:val="16"/>
+      </w:rPr>
+      <w:t>Intradark Pty Ltd  ·  ABN 38 696 182 457  ·  Commercial in confidence</w:t>
+    </w:r>
+    <w:r>
+      <w:rPr>
+        <w:sz w:val="16"/>
+      </w:rPr>
+      <w:tab/>
+    </w:r>
+    <w:r>
+      <w:rPr>
+        <w:color w:val="6B7280"/>
+        <w:sz w:val="16"/>
+      </w:rPr>
+      <w:t xml:space="preserve">Page </w:t>
+    </w:r>
+    <w:r>
+      <w:rPr>
+        <w:color w:val="6B7280"/>
+        <w:sz w:val="16"/>
+      </w:rPr>
+      <w:fldChar w:fldCharType="begin"/>
+      <w:instrText xml:space="preserve">PAGE</w:instrText>
+      <w:fldChar w:fldCharType="end"/>
+    </w:r>
+    <w:r>
+      <w:rPr>
+        <w:color w:val="6B7280"/>
+        <w:sz w:val="16"/>
+      </w:rPr>
+      <w:t xml:space="preserve"> of </w:t>
+    </w:r>
+    <w:r>
+      <w:rPr>
+        <w:color w:val="6B7280"/>
+        <w:sz w:val="16"/>
+      </w:rPr>
+      <w:fldChar w:fldCharType="begin"/>
+      <w:instrText xml:space="preserve">NUMPAGES</w:instrText>
+      <w:fldChar w:fldCharType="end"/>
+    </w:r>
+  </w:p>
+</w:ftr>
 </file>
 
 <file path=word/numbering.xml><?xml version="1.0" encoding="utf-8"?>
@@ -4879,6 +5176,9 @@
     <w:name w:val="Normal"/>
     <w:qFormat/>
     <w:rsid w:val="00FC693F"/>
+    <w:pPr>
+      <w:spacing w:after="120" w:line="269" w:lineRule="auto"/>
+    </w:pPr>
     <w:rPr>
       <w:rFonts w:ascii="Calibri" w:hAnsi="Calibri"/>
       <w:color w:val="1F2937"/>

</xml_diff>

<commit_message>
docs(bullyproof): embed intradark wordmark on cover and running header of outgoing docs
</commit_message>
<xml_diff>
--- a/apps/bullyproof/docs/change-request/quote-2026-06-29/reply-2026-07-07/01-M2-M8-classification.docx
+++ b/apps/bullyproof/docs/change-request/quote-2026-06-29/reply-2026-07-07/01-M2-M8-classification.docx
@@ -2,6 +2,45 @@
 <file path=word/document.xml><?xml version="1.0" encoding="utf-8"?>
 <w:document xmlns:wpc="http://schemas.microsoft.com/office/word/2010/wordprocessingCanvas" xmlns:mo="http://schemas.microsoft.com/office/mac/office/2008/main" xmlns:mc="http://schemas.openxmlformats.org/markup-compatibility/2006" xmlns:mv="urn:schemas-microsoft-com:mac:vml" xmlns:o="urn:schemas-microsoft-com:office:office" xmlns:r="http://schemas.openxmlformats.org/officeDocument/2006/relationships" xmlns:m="http://schemas.openxmlformats.org/officeDocument/2006/math" xmlns:v="urn:schemas-microsoft-com:vml" xmlns:wp14="http://schemas.microsoft.com/office/word/2010/wordprocessingDrawing" xmlns:wp="http://schemas.openxmlformats.org/drawingml/2006/wordprocessingDrawing" xmlns:w10="urn:schemas-microsoft-com:office:word" xmlns:w="http://schemas.openxmlformats.org/wordprocessingml/2006/main" xmlns:w14="http://schemas.microsoft.com/office/word/2010/wordml" xmlns:wpg="http://schemas.microsoft.com/office/word/2010/wordprocessingGroup" xmlns:wpi="http://schemas.microsoft.com/office/word/2010/wordprocessingInk" xmlns:wne="http://schemas.microsoft.com/office/word/2006/wordml" xmlns:wps="http://schemas.microsoft.com/office/word/2010/wordprocessingShape" mc:Ignorable="w14 wp14">
   <w:body>
+    <w:p>
+      <w:pPr>
+        <w:spacing w:after="360"/>
+      </w:pPr>
+      <w:r>
+        <w:drawing>
+          <wp:inline xmlns:a="http://schemas.openxmlformats.org/drawingml/2006/main" xmlns:pic="http://schemas.openxmlformats.org/drawingml/2006/picture">
+            <wp:extent cx="1952625" cy="267666"/>
+            <wp:docPr id="1" name="Picture 1"/>
+            <wp:cNvGraphicFramePr>
+              <a:graphicFrameLocks noChangeAspect="1"/>
+            </wp:cNvGraphicFramePr>
+            <a:graphic>
+              <a:graphicData uri="http://schemas.openxmlformats.org/drawingml/2006/picture">
+                <pic:pic>
+                  <pic:nvPicPr>
+                    <pic:cNvPr id="0" name="intradark-wordmark.png"/>
+                    <pic:cNvPicPr/>
+                  </pic:nvPicPr>
+                  <pic:blipFill>
+                    <a:blip r:embed="rId12"/>
+                    <a:stretch>
+                      <a:fillRect/>
+                    </a:stretch>
+                  </pic:blipFill>
+                  <pic:spPr>
+                    <a:xfrm>
+                      <a:off x="0" y="0"/>
+                      <a:ext cx="1952625" cy="267666"/>
+                    </a:xfrm>
+                    <a:prstGeom prst="rect"/>
+                  </pic:spPr>
+                </pic:pic>
+              </a:graphicData>
+            </a:graphic>
+          </wp:inline>
+        </w:drawing>
+      </w:r>
+    </w:p>
     <w:p>
       <w:pPr>
         <w:pStyle w:val="Heading1"/>
@@ -4742,9 +4781,12 @@
     </w:p>
     <w:sectPr>
       <w:footerReference w:type="default" r:id="rId9"/>
+      <w:footerReference w:type="first" r:id="rId10"/>
+      <w:headerReference w:type="default" r:id="rId11"/>
       <w:pgSz w:w="12240" w:h="15840"/>
       <w:pgMar w:top="1247" w:right="1361" w:bottom="1134" w:left="1361" w:header="720" w:footer="720" w:gutter="0"/>
       <w:cols w:space="720"/>
+      <w:titlePg/>
       <w:docGrid w:linePitch="360"/>
     </w:sectPr>
   </w:body>
@@ -4811,6 +4853,114 @@
     </w:r>
   </w:p>
 </w:ftr>
+</file>
+
+<file path=word/footer2.xml><?xml version="1.0" encoding="utf-8"?>
+<w:ftr xmlns:m="http://schemas.openxmlformats.org/officeDocument/2006/math" xmlns:mc="http://schemas.openxmlformats.org/markup-compatibility/2006" xmlns:mo="http://schemas.microsoft.com/office/mac/office/2008/main" xmlns:mv="urn:schemas-microsoft-com:mac:vml" xmlns:o="urn:schemas-microsoft-com:office:office" xmlns:r="http://schemas.openxmlformats.org/officeDocument/2006/relationships" xmlns:v="urn:schemas-microsoft-com:vml" xmlns:w10="urn:schemas-microsoft-com:office:word" xmlns:w14="http://schemas.microsoft.com/office/word/2010/wordml" xmlns:w="http://schemas.openxmlformats.org/wordprocessingml/2006/main" xmlns:wne="http://schemas.microsoft.com/office/word/2006/wordml" xmlns:wp14="http://schemas.microsoft.com/office/word/2010/wordprocessingDrawing" xmlns:wp="http://schemas.openxmlformats.org/drawingml/2006/wordprocessingDrawing" xmlns:wpc="http://schemas.microsoft.com/office/word/2010/wordprocessingCanvas" xmlns:wpg="http://schemas.microsoft.com/office/word/2010/wordprocessingGroup" xmlns:wpi="http://schemas.microsoft.com/office/word/2010/wordprocessingInk" xmlns:wps="http://schemas.microsoft.com/office/word/2010/wordprocessingShape" mc:Ignorable="w14 wp14">
+  <w:p>
+    <w:pPr>
+      <w:pStyle w:val="Footer"/>
+      <w:tabs>
+        <w:tab w:pos="9518" w:val="right"/>
+      </w:tabs>
+      <w:pBdr>
+        <w:top w:val="single" w:sz="4" w:space="6" w:color="008490"/>
+      </w:pBdr>
+    </w:pPr>
+    <w:r/>
+    <w:r>
+      <w:rPr>
+        <w:color w:val="6B7280"/>
+        <w:sz w:val="16"/>
+      </w:rPr>
+      <w:t>Intradark Pty Ltd  ·  ABN 38 696 182 457  ·  Commercial in confidence</w:t>
+    </w:r>
+    <w:r>
+      <w:rPr>
+        <w:sz w:val="16"/>
+      </w:rPr>
+      <w:tab/>
+    </w:r>
+    <w:r>
+      <w:rPr>
+        <w:color w:val="6B7280"/>
+        <w:sz w:val="16"/>
+      </w:rPr>
+      <w:t xml:space="preserve">Page </w:t>
+    </w:r>
+    <w:r>
+      <w:rPr>
+        <w:color w:val="6B7280"/>
+        <w:sz w:val="16"/>
+      </w:rPr>
+      <w:fldChar w:fldCharType="begin"/>
+      <w:instrText xml:space="preserve">PAGE</w:instrText>
+      <w:fldChar w:fldCharType="end"/>
+    </w:r>
+    <w:r>
+      <w:rPr>
+        <w:color w:val="6B7280"/>
+        <w:sz w:val="16"/>
+      </w:rPr>
+      <w:t xml:space="preserve"> of </w:t>
+    </w:r>
+    <w:r>
+      <w:rPr>
+        <w:color w:val="6B7280"/>
+        <w:sz w:val="16"/>
+      </w:rPr>
+      <w:fldChar w:fldCharType="begin"/>
+      <w:instrText xml:space="preserve">NUMPAGES</w:instrText>
+      <w:fldChar w:fldCharType="end"/>
+    </w:r>
+  </w:p>
+</w:ftr>
+</file>
+
+<file path=word/header1.xml><?xml version="1.0" encoding="utf-8"?>
+<w:hdr xmlns:m="http://schemas.openxmlformats.org/officeDocument/2006/math" xmlns:mc="http://schemas.openxmlformats.org/markup-compatibility/2006" xmlns:mo="http://schemas.microsoft.com/office/mac/office/2008/main" xmlns:mv="urn:schemas-microsoft-com:mac:vml" xmlns:o="urn:schemas-microsoft-com:office:office" xmlns:r="http://schemas.openxmlformats.org/officeDocument/2006/relationships" xmlns:v="urn:schemas-microsoft-com:vml" xmlns:w10="urn:schemas-microsoft-com:office:word" xmlns:w14="http://schemas.microsoft.com/office/word/2010/wordml" xmlns:w="http://schemas.openxmlformats.org/wordprocessingml/2006/main" xmlns:wne="http://schemas.microsoft.com/office/word/2006/wordml" xmlns:wp14="http://schemas.microsoft.com/office/word/2010/wordprocessingDrawing" xmlns:wp="http://schemas.openxmlformats.org/drawingml/2006/wordprocessingDrawing" xmlns:wpc="http://schemas.microsoft.com/office/word/2010/wordprocessingCanvas" xmlns:wpg="http://schemas.microsoft.com/office/word/2010/wordprocessingGroup" xmlns:wpi="http://schemas.microsoft.com/office/word/2010/wordprocessingInk" xmlns:wps="http://schemas.microsoft.com/office/word/2010/wordprocessingShape" mc:Ignorable="w14 wp14">
+  <w:p>
+    <w:pPr>
+      <w:pStyle w:val="Header"/>
+      <w:jc w:val="right"/>
+    </w:pPr>
+    <w:r/>
+    <w:r>
+      <w:drawing>
+        <wp:inline xmlns:a="http://schemas.openxmlformats.org/drawingml/2006/main" xmlns:pic="http://schemas.openxmlformats.org/drawingml/2006/picture">
+          <wp:extent cx="904875" cy="124040"/>
+          <wp:docPr id="1" name="Picture 1"/>
+          <wp:cNvGraphicFramePr>
+            <a:graphicFrameLocks noChangeAspect="1"/>
+          </wp:cNvGraphicFramePr>
+          <a:graphic>
+            <a:graphicData uri="http://schemas.openxmlformats.org/drawingml/2006/picture">
+              <pic:pic>
+                <pic:nvPicPr>
+                  <pic:cNvPr id="0" name="intradark-wordmark.png"/>
+                  <pic:cNvPicPr/>
+                </pic:nvPicPr>
+                <pic:blipFill>
+                  <a:blip r:embed="rId1"/>
+                  <a:stretch>
+                    <a:fillRect/>
+                  </a:stretch>
+                </pic:blipFill>
+                <pic:spPr>
+                  <a:xfrm>
+                    <a:off x="0" y="0"/>
+                    <a:ext cx="904875" cy="124040"/>
+                  </a:xfrm>
+                  <a:prstGeom prst="rect"/>
+                </pic:spPr>
+              </pic:pic>
+            </a:graphicData>
+          </a:graphic>
+        </wp:inline>
+      </w:drawing>
+    </w:r>
+  </w:p>
+</w:hdr>
 </file>
 
 <file path=word/numbering.xml><?xml version="1.0" encoding="utf-8"?>

</xml_diff>

<commit_message>
docs(bullyproof): boutique full-bleed cover pages on all outgoing docs; A4 page size, fixed footer tab stops, register FINAL numbered sections on new pages
</commit_message>
<xml_diff>
--- a/apps/bullyproof/docs/change-request/quote-2026-06-29/reply-2026-07-07/01-M2-M8-classification.docx
+++ b/apps/bullyproof/docs/change-request/quote-2026-06-29/reply-2026-07-07/01-M2-M8-classification.docx
@@ -3,26 +3,32 @@
 <w:document xmlns:wpc="http://schemas.microsoft.com/office/word/2010/wordprocessingCanvas" xmlns:mo="http://schemas.microsoft.com/office/mac/office/2008/main" xmlns:mc="http://schemas.openxmlformats.org/markup-compatibility/2006" xmlns:mv="urn:schemas-microsoft-com:mac:vml" xmlns:o="urn:schemas-microsoft-com:office:office" xmlns:r="http://schemas.openxmlformats.org/officeDocument/2006/relationships" xmlns:m="http://schemas.openxmlformats.org/officeDocument/2006/math" xmlns:v="urn:schemas-microsoft-com:vml" xmlns:wp14="http://schemas.microsoft.com/office/word/2010/wordprocessingDrawing" xmlns:wp="http://schemas.openxmlformats.org/drawingml/2006/wordprocessingDrawing" xmlns:w10="urn:schemas-microsoft-com:office:word" xmlns:w="http://schemas.openxmlformats.org/wordprocessingml/2006/main" xmlns:w14="http://schemas.microsoft.com/office/word/2010/wordml" xmlns:wpg="http://schemas.microsoft.com/office/word/2010/wordprocessingGroup" xmlns:wpi="http://schemas.microsoft.com/office/word/2010/wordprocessingInk" xmlns:wne="http://schemas.microsoft.com/office/word/2006/wordml" xmlns:wps="http://schemas.microsoft.com/office/word/2010/wordprocessingShape" mc:Ignorable="w14 wp14">
   <w:body>
     <w:p>
-      <w:pPr>
-        <w:spacing w:after="360"/>
-      </w:pPr>
       <w:r>
         <w:drawing>
-          <wp:inline xmlns:a="http://schemas.openxmlformats.org/drawingml/2006/main" xmlns:pic="http://schemas.openxmlformats.org/drawingml/2006/picture">
-            <wp:extent cx="1952625" cy="267666"/>
+          <wp:anchor distT="0" distB="0" distL="0" distR="0" simplePos="0" relativeHeight="1" behindDoc="1" locked="0" layoutInCell="1" allowOverlap="1">
+            <wp:simplePos x="0" y="0"/>
+            <wp:positionH relativeFrom="page">
+              <wp:posOffset>0</wp:posOffset>
+            </wp:positionH>
+            <wp:positionV relativeFrom="page">
+              <wp:posOffset>0</wp:posOffset>
+            </wp:positionV>
+            <wp:extent cx="7560310" cy="10692130"/>
+            <wp:effectExtent l="0" t="0" r="0" b="0"/>
+            <wp:wrapNone/>
             <wp:docPr id="1" name="Picture 1"/>
-            <wp:cNvGraphicFramePr>
+            <wp:cNvGraphicFramePr xmlns:a="http://schemas.openxmlformats.org/drawingml/2006/main">
               <a:graphicFrameLocks noChangeAspect="1"/>
             </wp:cNvGraphicFramePr>
-            <a:graphic>
+            <a:graphic xmlns:a="http://schemas.openxmlformats.org/drawingml/2006/main" xmlns:pic="http://schemas.openxmlformats.org/drawingml/2006/picture">
               <a:graphicData uri="http://schemas.openxmlformats.org/drawingml/2006/picture">
                 <pic:pic>
                   <pic:nvPicPr>
-                    <pic:cNvPr id="0" name="intradark-wordmark.png"/>
+                    <pic:cNvPr id="0" name="01-M2-M8-classification.png"/>
                     <pic:cNvPicPr/>
                   </pic:nvPicPr>
                   <pic:blipFill>
-                    <a:blip r:embed="rId12"/>
+                    <a:blip r:embed="rId11"/>
                     <a:stretch>
                       <a:fillRect/>
                     </a:stretch>
@@ -30,24 +36,25 @@
                   <pic:spPr>
                     <a:xfrm>
                       <a:off x="0" y="0"/>
-                      <a:ext cx="1952625" cy="267666"/>
+                      <a:ext cx="7560310" cy="10692130"/>
                     </a:xfrm>
                     <a:prstGeom prst="rect"/>
                   </pic:spPr>
                 </pic:pic>
               </a:graphicData>
             </a:graphic>
-          </wp:inline>
+          </wp:anchor>
         </w:drawing>
+        <w:br w:type="page"/>
       </w:r>
     </w:p>
     <w:p>
       <w:pPr>
         <w:pStyle w:val="Heading1"/>
-        <w:spacing w:after="80"/>
         <w:pBdr>
           <w:bottom w:val="single" w:sz="10" w:space="8" w:color="008490"/>
         </w:pBdr>
+        <w:spacing w:after="80"/>
       </w:pPr>
       <w:r>
         <w:rPr>
@@ -61,11 +68,11 @@
     </w:p>
     <w:p>
       <w:pPr>
-        <w:spacing w:before="80" w:after="200"/>
-        <w:ind w:left="280"/>
         <w:pBdr>
           <w:left w:val="single" w:sz="12" w:space="8" w:color="008490"/>
         </w:pBdr>
+        <w:spacing w:before="80" w:after="200"/>
+        <w:ind w:left="280"/>
       </w:pPr>
       <w:r>
         <w:rPr>
@@ -78,11 +85,11 @@
     </w:p>
     <w:p>
       <w:pPr>
-        <w:spacing w:before="80" w:after="200"/>
-        <w:ind w:left="280"/>
         <w:pBdr>
           <w:left w:val="single" w:sz="12" w:space="8" w:color="008490"/>
         </w:pBdr>
+        <w:spacing w:before="80" w:after="200"/>
+        <w:ind w:left="280"/>
       </w:pPr>
       <w:r>
         <w:rPr>
@@ -95,11 +102,11 @@
     </w:p>
     <w:p>
       <w:pPr>
-        <w:spacing w:before="80" w:after="200"/>
-        <w:ind w:left="280"/>
         <w:pBdr>
           <w:left w:val="single" w:sz="12" w:space="8" w:color="008490"/>
         </w:pBdr>
+        <w:spacing w:before="80" w:after="200"/>
+        <w:ind w:left="280"/>
       </w:pPr>
       <w:r>
         <w:rPr>
@@ -155,11 +162,11 @@
     </w:p>
     <w:p>
       <w:pPr>
-        <w:spacing w:before="80" w:after="200"/>
-        <w:ind w:left="280"/>
         <w:pBdr>
           <w:left w:val="single" w:sz="12" w:space="8" w:color="008490"/>
         </w:pBdr>
+        <w:spacing w:before="80" w:after="200"/>
+        <w:ind w:left="280"/>
       </w:pPr>
       <w:r>
         <w:rPr>
@@ -189,11 +196,11 @@
     </w:p>
     <w:p>
       <w:pPr>
-        <w:spacing w:before="80" w:after="200"/>
-        <w:ind w:left="280"/>
         <w:pBdr>
           <w:left w:val="single" w:sz="12" w:space="8" w:color="008490"/>
         </w:pBdr>
+        <w:spacing w:before="80" w:after="200"/>
+        <w:ind w:left="280"/>
       </w:pPr>
       <w:r>
         <w:rPr>
@@ -206,11 +213,11 @@
     </w:p>
     <w:p>
       <w:pPr>
-        <w:spacing w:before="80" w:after="200"/>
-        <w:ind w:left="280"/>
         <w:pBdr>
           <w:left w:val="single" w:sz="12" w:space="8" w:color="008490"/>
         </w:pBdr>
+        <w:spacing w:before="80" w:after="200"/>
+        <w:ind w:left="280"/>
       </w:pPr>
       <w:r>
         <w:rPr>
@@ -223,11 +230,11 @@
     </w:p>
     <w:p>
       <w:pPr>
-        <w:spacing w:before="80" w:after="200"/>
-        <w:ind w:left="280"/>
         <w:pBdr>
           <w:left w:val="single" w:sz="12" w:space="8" w:color="008490"/>
         </w:pBdr>
+        <w:spacing w:before="80" w:after="200"/>
+        <w:ind w:left="280"/>
       </w:pPr>
       <w:r>
         <w:rPr>
@@ -240,11 +247,11 @@
     </w:p>
     <w:p>
       <w:pPr>
-        <w:spacing w:before="80" w:after="200"/>
-        <w:ind w:left="280"/>
         <w:pBdr>
           <w:left w:val="single" w:sz="12" w:space="8" w:color="008490"/>
         </w:pBdr>
+        <w:spacing w:before="80" w:after="200"/>
+        <w:ind w:left="280"/>
       </w:pPr>
       <w:r>
         <w:rPr>
@@ -263,15 +270,15 @@
         <w:tblLook w:firstColumn="1" w:firstRow="1" w:lastColumn="0" w:lastRow="0" w:noHBand="0" w:noVBand="1" w:val="04A0"/>
       </w:tblPr>
       <w:tblGrid>
-        <w:gridCol w:w="2379"/>
-        <w:gridCol w:w="2379"/>
-        <w:gridCol w:w="2379"/>
-        <w:gridCol w:w="2379"/>
+        <w:gridCol w:w="2296"/>
+        <w:gridCol w:w="2296"/>
+        <w:gridCol w:w="2296"/>
+        <w:gridCol w:w="2296"/>
       </w:tblGrid>
       <w:tr>
         <w:tc>
           <w:tcPr>
-            <w:tcW w:type="dxa" w:w="2379"/>
+            <w:tcW w:type="dxa" w:w="2296"/>
             <w:shd w:val="clear" w:fill="008490"/>
           </w:tcPr>
           <w:p>
@@ -294,7 +301,7 @@
         </w:tc>
         <w:tc>
           <w:tcPr>
-            <w:tcW w:type="dxa" w:w="2379"/>
+            <w:tcW w:type="dxa" w:w="2296"/>
             <w:shd w:val="clear" w:fill="008490"/>
           </w:tcPr>
           <w:p>
@@ -317,7 +324,7 @@
         </w:tc>
         <w:tc>
           <w:tcPr>
-            <w:tcW w:type="dxa" w:w="2379"/>
+            <w:tcW w:type="dxa" w:w="2296"/>
             <w:shd w:val="clear" w:fill="008490"/>
           </w:tcPr>
           <w:p>
@@ -340,7 +347,7 @@
         </w:tc>
         <w:tc>
           <w:tcPr>
-            <w:tcW w:type="dxa" w:w="2379"/>
+            <w:tcW w:type="dxa" w:w="2296"/>
             <w:shd w:val="clear" w:fill="008490"/>
           </w:tcPr>
           <w:p>
@@ -365,7 +372,7 @@
       <w:tr>
         <w:tc>
           <w:tcPr>
-            <w:tcW w:type="dxa" w:w="2379"/>
+            <w:tcW w:type="dxa" w:w="2296"/>
           </w:tcPr>
           <w:p>
             <w:r>
@@ -383,7 +390,7 @@
         </w:tc>
         <w:tc>
           <w:tcPr>
-            <w:tcW w:type="dxa" w:w="2379"/>
+            <w:tcW w:type="dxa" w:w="2296"/>
           </w:tcPr>
           <w:p>
             <w:r>
@@ -401,7 +408,7 @@
         </w:tc>
         <w:tc>
           <w:tcPr>
-            <w:tcW w:type="dxa" w:w="2379"/>
+            <w:tcW w:type="dxa" w:w="2296"/>
           </w:tcPr>
           <w:p>
             <w:r>
@@ -419,7 +426,7 @@
         </w:tc>
         <w:tc>
           <w:tcPr>
-            <w:tcW w:type="dxa" w:w="2379"/>
+            <w:tcW w:type="dxa" w:w="2296"/>
           </w:tcPr>
           <w:p>
             <w:r>
@@ -439,7 +446,7 @@
       <w:tr>
         <w:tc>
           <w:tcPr>
-            <w:tcW w:type="dxa" w:w="2379"/>
+            <w:tcW w:type="dxa" w:w="2296"/>
             <w:shd w:val="clear" w:fill="F2F7F7"/>
           </w:tcPr>
           <w:p>
@@ -458,7 +465,7 @@
         </w:tc>
         <w:tc>
           <w:tcPr>
-            <w:tcW w:type="dxa" w:w="2379"/>
+            <w:tcW w:type="dxa" w:w="2296"/>
             <w:shd w:val="clear" w:fill="F2F7F7"/>
           </w:tcPr>
           <w:p>
@@ -477,7 +484,7 @@
         </w:tc>
         <w:tc>
           <w:tcPr>
-            <w:tcW w:type="dxa" w:w="2379"/>
+            <w:tcW w:type="dxa" w:w="2296"/>
             <w:shd w:val="clear" w:fill="F2F7F7"/>
           </w:tcPr>
           <w:p>
@@ -496,7 +503,7 @@
         </w:tc>
         <w:tc>
           <w:tcPr>
-            <w:tcW w:type="dxa" w:w="2379"/>
+            <w:tcW w:type="dxa" w:w="2296"/>
             <w:shd w:val="clear" w:fill="F2F7F7"/>
           </w:tcPr>
           <w:p>
@@ -517,7 +524,7 @@
       <w:tr>
         <w:tc>
           <w:tcPr>
-            <w:tcW w:type="dxa" w:w="2379"/>
+            <w:tcW w:type="dxa" w:w="2296"/>
           </w:tcPr>
           <w:p>
             <w:r>
@@ -535,7 +542,7 @@
         </w:tc>
         <w:tc>
           <w:tcPr>
-            <w:tcW w:type="dxa" w:w="2379"/>
+            <w:tcW w:type="dxa" w:w="2296"/>
           </w:tcPr>
           <w:p>
             <w:r>
@@ -553,7 +560,7 @@
         </w:tc>
         <w:tc>
           <w:tcPr>
-            <w:tcW w:type="dxa" w:w="2379"/>
+            <w:tcW w:type="dxa" w:w="2296"/>
           </w:tcPr>
           <w:p>
             <w:r>
@@ -571,7 +578,7 @@
         </w:tc>
         <w:tc>
           <w:tcPr>
-            <w:tcW w:type="dxa" w:w="2379"/>
+            <w:tcW w:type="dxa" w:w="2296"/>
           </w:tcPr>
           <w:p>
             <w:r>
@@ -591,7 +598,7 @@
       <w:tr>
         <w:tc>
           <w:tcPr>
-            <w:tcW w:type="dxa" w:w="2379"/>
+            <w:tcW w:type="dxa" w:w="2296"/>
             <w:shd w:val="clear" w:fill="F2F7F7"/>
           </w:tcPr>
           <w:p>
@@ -610,7 +617,7 @@
         </w:tc>
         <w:tc>
           <w:tcPr>
-            <w:tcW w:type="dxa" w:w="2379"/>
+            <w:tcW w:type="dxa" w:w="2296"/>
             <w:shd w:val="clear" w:fill="F2F7F7"/>
           </w:tcPr>
           <w:p>
@@ -629,7 +636,7 @@
         </w:tc>
         <w:tc>
           <w:tcPr>
-            <w:tcW w:type="dxa" w:w="2379"/>
+            <w:tcW w:type="dxa" w:w="2296"/>
             <w:shd w:val="clear" w:fill="F2F7F7"/>
           </w:tcPr>
           <w:p>
@@ -648,7 +655,7 @@
         </w:tc>
         <w:tc>
           <w:tcPr>
-            <w:tcW w:type="dxa" w:w="2379"/>
+            <w:tcW w:type="dxa" w:w="2296"/>
             <w:shd w:val="clear" w:fill="F2F7F7"/>
           </w:tcPr>
           <w:p>
@@ -669,7 +676,7 @@
       <w:tr>
         <w:tc>
           <w:tcPr>
-            <w:tcW w:type="dxa" w:w="2379"/>
+            <w:tcW w:type="dxa" w:w="2296"/>
           </w:tcPr>
           <w:p>
             <w:r>
@@ -687,7 +694,7 @@
         </w:tc>
         <w:tc>
           <w:tcPr>
-            <w:tcW w:type="dxa" w:w="2379"/>
+            <w:tcW w:type="dxa" w:w="2296"/>
           </w:tcPr>
           <w:p>
             <w:r>
@@ -705,7 +712,7 @@
         </w:tc>
         <w:tc>
           <w:tcPr>
-            <w:tcW w:type="dxa" w:w="2379"/>
+            <w:tcW w:type="dxa" w:w="2296"/>
           </w:tcPr>
           <w:p>
             <w:r>
@@ -723,7 +730,7 @@
         </w:tc>
         <w:tc>
           <w:tcPr>
-            <w:tcW w:type="dxa" w:w="2379"/>
+            <w:tcW w:type="dxa" w:w="2296"/>
           </w:tcPr>
           <w:p>
             <w:r>
@@ -743,7 +750,7 @@
       <w:tr>
         <w:tc>
           <w:tcPr>
-            <w:tcW w:type="dxa" w:w="2379"/>
+            <w:tcW w:type="dxa" w:w="2296"/>
             <w:shd w:val="clear" w:fill="F2F7F7"/>
           </w:tcPr>
           <w:p>
@@ -762,7 +769,7 @@
         </w:tc>
         <w:tc>
           <w:tcPr>
-            <w:tcW w:type="dxa" w:w="2379"/>
+            <w:tcW w:type="dxa" w:w="2296"/>
             <w:shd w:val="clear" w:fill="F2F7F7"/>
           </w:tcPr>
           <w:p>
@@ -781,7 +788,7 @@
         </w:tc>
         <w:tc>
           <w:tcPr>
-            <w:tcW w:type="dxa" w:w="2379"/>
+            <w:tcW w:type="dxa" w:w="2296"/>
             <w:shd w:val="clear" w:fill="F2F7F7"/>
           </w:tcPr>
           <w:p>
@@ -800,7 +807,7 @@
         </w:tc>
         <w:tc>
           <w:tcPr>
-            <w:tcW w:type="dxa" w:w="2379"/>
+            <w:tcW w:type="dxa" w:w="2296"/>
             <w:shd w:val="clear" w:fill="F2F7F7"/>
           </w:tcPr>
           <w:p>
@@ -821,7 +828,7 @@
       <w:tr>
         <w:tc>
           <w:tcPr>
-            <w:tcW w:type="dxa" w:w="2379"/>
+            <w:tcW w:type="dxa" w:w="2296"/>
           </w:tcPr>
           <w:p>
             <w:r>
@@ -839,7 +846,7 @@
         </w:tc>
         <w:tc>
           <w:tcPr>
-            <w:tcW w:type="dxa" w:w="2379"/>
+            <w:tcW w:type="dxa" w:w="2296"/>
           </w:tcPr>
           <w:p>
             <w:r>
@@ -857,7 +864,7 @@
         </w:tc>
         <w:tc>
           <w:tcPr>
-            <w:tcW w:type="dxa" w:w="2379"/>
+            <w:tcW w:type="dxa" w:w="2296"/>
           </w:tcPr>
           <w:p>
             <w:r>
@@ -875,7 +882,7 @@
         </w:tc>
         <w:tc>
           <w:tcPr>
-            <w:tcW w:type="dxa" w:w="2379"/>
+            <w:tcW w:type="dxa" w:w="2296"/>
           </w:tcPr>
           <w:p>
             <w:r>
@@ -895,7 +902,7 @@
       <w:tr>
         <w:tc>
           <w:tcPr>
-            <w:tcW w:type="dxa" w:w="2379"/>
+            <w:tcW w:type="dxa" w:w="2296"/>
             <w:shd w:val="clear" w:fill="F2F7F7"/>
           </w:tcPr>
           <w:p>
@@ -914,7 +921,7 @@
         </w:tc>
         <w:tc>
           <w:tcPr>
-            <w:tcW w:type="dxa" w:w="2379"/>
+            <w:tcW w:type="dxa" w:w="2296"/>
             <w:shd w:val="clear" w:fill="F2F7F7"/>
           </w:tcPr>
           <w:p>
@@ -933,7 +940,7 @@
         </w:tc>
         <w:tc>
           <w:tcPr>
-            <w:tcW w:type="dxa" w:w="2379"/>
+            <w:tcW w:type="dxa" w:w="2296"/>
             <w:shd w:val="clear" w:fill="F2F7F7"/>
           </w:tcPr>
           <w:p>
@@ -952,7 +959,7 @@
         </w:tc>
         <w:tc>
           <w:tcPr>
-            <w:tcW w:type="dxa" w:w="2379"/>
+            <w:tcW w:type="dxa" w:w="2296"/>
             <w:shd w:val="clear" w:fill="F2F7F7"/>
           </w:tcPr>
           <w:p>
@@ -973,7 +980,7 @@
       <w:tr>
         <w:tc>
           <w:tcPr>
-            <w:tcW w:type="dxa" w:w="2379"/>
+            <w:tcW w:type="dxa" w:w="2296"/>
           </w:tcPr>
           <w:p>
             <w:r>
@@ -991,7 +998,7 @@
         </w:tc>
         <w:tc>
           <w:tcPr>
-            <w:tcW w:type="dxa" w:w="2379"/>
+            <w:tcW w:type="dxa" w:w="2296"/>
           </w:tcPr>
           <w:p>
             <w:r>
@@ -1009,7 +1016,7 @@
         </w:tc>
         <w:tc>
           <w:tcPr>
-            <w:tcW w:type="dxa" w:w="2379"/>
+            <w:tcW w:type="dxa" w:w="2296"/>
           </w:tcPr>
           <w:p>
             <w:r>
@@ -1027,7 +1034,7 @@
         </w:tc>
         <w:tc>
           <w:tcPr>
-            <w:tcW w:type="dxa" w:w="2379"/>
+            <w:tcW w:type="dxa" w:w="2296"/>
           </w:tcPr>
           <w:p>
             <w:r>
@@ -1047,7 +1054,7 @@
       <w:tr>
         <w:tc>
           <w:tcPr>
-            <w:tcW w:type="dxa" w:w="2379"/>
+            <w:tcW w:type="dxa" w:w="2296"/>
             <w:shd w:val="clear" w:fill="F2F7F7"/>
           </w:tcPr>
           <w:p>
@@ -1066,7 +1073,7 @@
         </w:tc>
         <w:tc>
           <w:tcPr>
-            <w:tcW w:type="dxa" w:w="2379"/>
+            <w:tcW w:type="dxa" w:w="2296"/>
             <w:shd w:val="clear" w:fill="F2F7F7"/>
           </w:tcPr>
           <w:p>
@@ -1085,7 +1092,7 @@
         </w:tc>
         <w:tc>
           <w:tcPr>
-            <w:tcW w:type="dxa" w:w="2379"/>
+            <w:tcW w:type="dxa" w:w="2296"/>
             <w:shd w:val="clear" w:fill="F2F7F7"/>
           </w:tcPr>
           <w:p>
@@ -1104,7 +1111,7 @@
         </w:tc>
         <w:tc>
           <w:tcPr>
-            <w:tcW w:type="dxa" w:w="2379"/>
+            <w:tcW w:type="dxa" w:w="2296"/>
             <w:shd w:val="clear" w:fill="F2F7F7"/>
           </w:tcPr>
           <w:p>
@@ -1125,7 +1132,7 @@
       <w:tr>
         <w:tc>
           <w:tcPr>
-            <w:tcW w:type="dxa" w:w="2379"/>
+            <w:tcW w:type="dxa" w:w="2296"/>
           </w:tcPr>
           <w:p>
             <w:r>
@@ -1143,7 +1150,7 @@
         </w:tc>
         <w:tc>
           <w:tcPr>
-            <w:tcW w:type="dxa" w:w="2379"/>
+            <w:tcW w:type="dxa" w:w="2296"/>
           </w:tcPr>
           <w:p>
             <w:r>
@@ -1161,7 +1168,7 @@
         </w:tc>
         <w:tc>
           <w:tcPr>
-            <w:tcW w:type="dxa" w:w="2379"/>
+            <w:tcW w:type="dxa" w:w="2296"/>
           </w:tcPr>
           <w:p>
             <w:r>
@@ -1179,7 +1186,7 @@
         </w:tc>
         <w:tc>
           <w:tcPr>
-            <w:tcW w:type="dxa" w:w="2379"/>
+            <w:tcW w:type="dxa" w:w="2296"/>
           </w:tcPr>
           <w:p>
             <w:r>
@@ -1199,7 +1206,7 @@
       <w:tr>
         <w:tc>
           <w:tcPr>
-            <w:tcW w:type="dxa" w:w="2379"/>
+            <w:tcW w:type="dxa" w:w="2296"/>
             <w:shd w:val="clear" w:fill="F2F7F7"/>
           </w:tcPr>
           <w:p>
@@ -1218,7 +1225,7 @@
         </w:tc>
         <w:tc>
           <w:tcPr>
-            <w:tcW w:type="dxa" w:w="2379"/>
+            <w:tcW w:type="dxa" w:w="2296"/>
             <w:shd w:val="clear" w:fill="F2F7F7"/>
           </w:tcPr>
           <w:p>
@@ -1237,7 +1244,7 @@
         </w:tc>
         <w:tc>
           <w:tcPr>
-            <w:tcW w:type="dxa" w:w="2379"/>
+            <w:tcW w:type="dxa" w:w="2296"/>
             <w:shd w:val="clear" w:fill="F2F7F7"/>
           </w:tcPr>
           <w:p>
@@ -1256,7 +1263,7 @@
         </w:tc>
         <w:tc>
           <w:tcPr>
-            <w:tcW w:type="dxa" w:w="2379"/>
+            <w:tcW w:type="dxa" w:w="2296"/>
             <w:shd w:val="clear" w:fill="F2F7F7"/>
           </w:tcPr>
           <w:p>
@@ -1277,7 +1284,7 @@
       <w:tr>
         <w:tc>
           <w:tcPr>
-            <w:tcW w:type="dxa" w:w="2379"/>
+            <w:tcW w:type="dxa" w:w="2296"/>
           </w:tcPr>
           <w:p>
             <w:r>
@@ -1295,7 +1302,7 @@
         </w:tc>
         <w:tc>
           <w:tcPr>
-            <w:tcW w:type="dxa" w:w="2379"/>
+            <w:tcW w:type="dxa" w:w="2296"/>
           </w:tcPr>
           <w:p>
             <w:r>
@@ -1313,7 +1320,7 @@
         </w:tc>
         <w:tc>
           <w:tcPr>
-            <w:tcW w:type="dxa" w:w="2379"/>
+            <w:tcW w:type="dxa" w:w="2296"/>
           </w:tcPr>
           <w:p>
             <w:r>
@@ -1331,7 +1338,7 @@
         </w:tc>
         <w:tc>
           <w:tcPr>
-            <w:tcW w:type="dxa" w:w="2379"/>
+            <w:tcW w:type="dxa" w:w="2296"/>
           </w:tcPr>
           <w:p>
             <w:r>
@@ -1351,7 +1358,7 @@
       <w:tr>
         <w:tc>
           <w:tcPr>
-            <w:tcW w:type="dxa" w:w="2379"/>
+            <w:tcW w:type="dxa" w:w="2296"/>
             <w:shd w:val="clear" w:fill="F2F7F7"/>
           </w:tcPr>
           <w:p>
@@ -1370,7 +1377,7 @@
         </w:tc>
         <w:tc>
           <w:tcPr>
-            <w:tcW w:type="dxa" w:w="2379"/>
+            <w:tcW w:type="dxa" w:w="2296"/>
             <w:shd w:val="clear" w:fill="F2F7F7"/>
           </w:tcPr>
           <w:p>
@@ -1389,7 +1396,7 @@
         </w:tc>
         <w:tc>
           <w:tcPr>
-            <w:tcW w:type="dxa" w:w="2379"/>
+            <w:tcW w:type="dxa" w:w="2296"/>
             <w:shd w:val="clear" w:fill="F2F7F7"/>
           </w:tcPr>
           <w:p>
@@ -1408,7 +1415,7 @@
         </w:tc>
         <w:tc>
           <w:tcPr>
-            <w:tcW w:type="dxa" w:w="2379"/>
+            <w:tcW w:type="dxa" w:w="2296"/>
             <w:shd w:val="clear" w:fill="F2F7F7"/>
           </w:tcPr>
           <w:p>
@@ -1429,7 +1436,7 @@
       <w:tr>
         <w:tc>
           <w:tcPr>
-            <w:tcW w:type="dxa" w:w="2379"/>
+            <w:tcW w:type="dxa" w:w="2296"/>
           </w:tcPr>
           <w:p>
             <w:r>
@@ -1447,7 +1454,7 @@
         </w:tc>
         <w:tc>
           <w:tcPr>
-            <w:tcW w:type="dxa" w:w="2379"/>
+            <w:tcW w:type="dxa" w:w="2296"/>
           </w:tcPr>
           <w:p>
             <w:r>
@@ -1465,7 +1472,7 @@
         </w:tc>
         <w:tc>
           <w:tcPr>
-            <w:tcW w:type="dxa" w:w="2379"/>
+            <w:tcW w:type="dxa" w:w="2296"/>
           </w:tcPr>
           <w:p>
             <w:r>
@@ -1483,7 +1490,7 @@
         </w:tc>
         <w:tc>
           <w:tcPr>
-            <w:tcW w:type="dxa" w:w="2379"/>
+            <w:tcW w:type="dxa" w:w="2296"/>
           </w:tcPr>
           <w:p>
             <w:r>
@@ -1503,7 +1510,7 @@
       <w:tr>
         <w:tc>
           <w:tcPr>
-            <w:tcW w:type="dxa" w:w="2379"/>
+            <w:tcW w:type="dxa" w:w="2296"/>
             <w:shd w:val="clear" w:fill="F2F7F7"/>
           </w:tcPr>
           <w:p>
@@ -1522,7 +1529,7 @@
         </w:tc>
         <w:tc>
           <w:tcPr>
-            <w:tcW w:type="dxa" w:w="2379"/>
+            <w:tcW w:type="dxa" w:w="2296"/>
             <w:shd w:val="clear" w:fill="F2F7F7"/>
           </w:tcPr>
           <w:p>
@@ -1541,7 +1548,7 @@
         </w:tc>
         <w:tc>
           <w:tcPr>
-            <w:tcW w:type="dxa" w:w="2379"/>
+            <w:tcW w:type="dxa" w:w="2296"/>
             <w:shd w:val="clear" w:fill="F2F7F7"/>
           </w:tcPr>
           <w:p>
@@ -1560,7 +1567,7 @@
         </w:tc>
         <w:tc>
           <w:tcPr>
-            <w:tcW w:type="dxa" w:w="2379"/>
+            <w:tcW w:type="dxa" w:w="2296"/>
             <w:shd w:val="clear" w:fill="F2F7F7"/>
           </w:tcPr>
           <w:p>
@@ -1581,7 +1588,7 @@
       <w:tr>
         <w:tc>
           <w:tcPr>
-            <w:tcW w:type="dxa" w:w="2379"/>
+            <w:tcW w:type="dxa" w:w="2296"/>
           </w:tcPr>
           <w:p>
             <w:r>
@@ -1599,7 +1606,7 @@
         </w:tc>
         <w:tc>
           <w:tcPr>
-            <w:tcW w:type="dxa" w:w="2379"/>
+            <w:tcW w:type="dxa" w:w="2296"/>
           </w:tcPr>
           <w:p>
             <w:r>
@@ -1617,7 +1624,7 @@
         </w:tc>
         <w:tc>
           <w:tcPr>
-            <w:tcW w:type="dxa" w:w="2379"/>
+            <w:tcW w:type="dxa" w:w="2296"/>
           </w:tcPr>
           <w:p>
             <w:r>
@@ -1635,7 +1642,7 @@
         </w:tc>
         <w:tc>
           <w:tcPr>
-            <w:tcW w:type="dxa" w:w="2379"/>
+            <w:tcW w:type="dxa" w:w="2296"/>
           </w:tcPr>
           <w:p>
             <w:r>
@@ -1655,7 +1662,7 @@
       <w:tr>
         <w:tc>
           <w:tcPr>
-            <w:tcW w:type="dxa" w:w="2379"/>
+            <w:tcW w:type="dxa" w:w="2296"/>
             <w:shd w:val="clear" w:fill="F2F7F7"/>
           </w:tcPr>
           <w:p>
@@ -1674,7 +1681,7 @@
         </w:tc>
         <w:tc>
           <w:tcPr>
-            <w:tcW w:type="dxa" w:w="2379"/>
+            <w:tcW w:type="dxa" w:w="2296"/>
             <w:shd w:val="clear" w:fill="F2F7F7"/>
           </w:tcPr>
           <w:p>
@@ -1693,7 +1700,7 @@
         </w:tc>
         <w:tc>
           <w:tcPr>
-            <w:tcW w:type="dxa" w:w="2379"/>
+            <w:tcW w:type="dxa" w:w="2296"/>
             <w:shd w:val="clear" w:fill="F2F7F7"/>
           </w:tcPr>
           <w:p>
@@ -1712,7 +1719,7 @@
         </w:tc>
         <w:tc>
           <w:tcPr>
-            <w:tcW w:type="dxa" w:w="2379"/>
+            <w:tcW w:type="dxa" w:w="2296"/>
             <w:shd w:val="clear" w:fill="F2F7F7"/>
           </w:tcPr>
           <w:p>
@@ -1733,7 +1740,7 @@
       <w:tr>
         <w:tc>
           <w:tcPr>
-            <w:tcW w:type="dxa" w:w="2379"/>
+            <w:tcW w:type="dxa" w:w="2296"/>
           </w:tcPr>
           <w:p>
             <w:r>
@@ -1751,7 +1758,7 @@
         </w:tc>
         <w:tc>
           <w:tcPr>
-            <w:tcW w:type="dxa" w:w="2379"/>
+            <w:tcW w:type="dxa" w:w="2296"/>
           </w:tcPr>
           <w:p>
             <w:r>
@@ -1769,7 +1776,7 @@
         </w:tc>
         <w:tc>
           <w:tcPr>
-            <w:tcW w:type="dxa" w:w="2379"/>
+            <w:tcW w:type="dxa" w:w="2296"/>
           </w:tcPr>
           <w:p>
             <w:r>
@@ -1787,7 +1794,7 @@
         </w:tc>
         <w:tc>
           <w:tcPr>
-            <w:tcW w:type="dxa" w:w="2379"/>
+            <w:tcW w:type="dxa" w:w="2296"/>
           </w:tcPr>
           <w:p>
             <w:r>
@@ -1807,7 +1814,7 @@
       <w:tr>
         <w:tc>
           <w:tcPr>
-            <w:tcW w:type="dxa" w:w="2379"/>
+            <w:tcW w:type="dxa" w:w="2296"/>
             <w:shd w:val="clear" w:fill="F2F7F7"/>
           </w:tcPr>
           <w:p>
@@ -1826,7 +1833,7 @@
         </w:tc>
         <w:tc>
           <w:tcPr>
-            <w:tcW w:type="dxa" w:w="2379"/>
+            <w:tcW w:type="dxa" w:w="2296"/>
             <w:shd w:val="clear" w:fill="F2F7F7"/>
           </w:tcPr>
           <w:p>
@@ -1845,7 +1852,7 @@
         </w:tc>
         <w:tc>
           <w:tcPr>
-            <w:tcW w:type="dxa" w:w="2379"/>
+            <w:tcW w:type="dxa" w:w="2296"/>
             <w:shd w:val="clear" w:fill="F2F7F7"/>
           </w:tcPr>
           <w:p>
@@ -1864,7 +1871,7 @@
         </w:tc>
         <w:tc>
           <w:tcPr>
-            <w:tcW w:type="dxa" w:w="2379"/>
+            <w:tcW w:type="dxa" w:w="2296"/>
             <w:shd w:val="clear" w:fill="F2F7F7"/>
           </w:tcPr>
           <w:p>
@@ -1885,7 +1892,7 @@
       <w:tr>
         <w:tc>
           <w:tcPr>
-            <w:tcW w:type="dxa" w:w="2379"/>
+            <w:tcW w:type="dxa" w:w="2296"/>
           </w:tcPr>
           <w:p>
             <w:r>
@@ -1903,7 +1910,7 @@
         </w:tc>
         <w:tc>
           <w:tcPr>
-            <w:tcW w:type="dxa" w:w="2379"/>
+            <w:tcW w:type="dxa" w:w="2296"/>
           </w:tcPr>
           <w:p>
             <w:r>
@@ -1921,7 +1928,7 @@
         </w:tc>
         <w:tc>
           <w:tcPr>
-            <w:tcW w:type="dxa" w:w="2379"/>
+            <w:tcW w:type="dxa" w:w="2296"/>
           </w:tcPr>
           <w:p>
             <w:r>
@@ -1939,7 +1946,7 @@
         </w:tc>
         <w:tc>
           <w:tcPr>
-            <w:tcW w:type="dxa" w:w="2379"/>
+            <w:tcW w:type="dxa" w:w="2296"/>
           </w:tcPr>
           <w:p>
             <w:r>
@@ -1959,7 +1966,7 @@
       <w:tr>
         <w:tc>
           <w:tcPr>
-            <w:tcW w:type="dxa" w:w="2379"/>
+            <w:tcW w:type="dxa" w:w="2296"/>
             <w:shd w:val="clear" w:fill="F2F7F7"/>
           </w:tcPr>
           <w:p>
@@ -1978,7 +1985,7 @@
         </w:tc>
         <w:tc>
           <w:tcPr>
-            <w:tcW w:type="dxa" w:w="2379"/>
+            <w:tcW w:type="dxa" w:w="2296"/>
             <w:shd w:val="clear" w:fill="F2F7F7"/>
           </w:tcPr>
           <w:p>
@@ -1997,7 +2004,7 @@
         </w:tc>
         <w:tc>
           <w:tcPr>
-            <w:tcW w:type="dxa" w:w="2379"/>
+            <w:tcW w:type="dxa" w:w="2296"/>
             <w:shd w:val="clear" w:fill="F2F7F7"/>
           </w:tcPr>
           <w:p>
@@ -2016,7 +2023,7 @@
         </w:tc>
         <w:tc>
           <w:tcPr>
-            <w:tcW w:type="dxa" w:w="2379"/>
+            <w:tcW w:type="dxa" w:w="2296"/>
             <w:shd w:val="clear" w:fill="F2F7F7"/>
           </w:tcPr>
           <w:p>
@@ -2037,7 +2044,7 @@
       <w:tr>
         <w:tc>
           <w:tcPr>
-            <w:tcW w:type="dxa" w:w="2379"/>
+            <w:tcW w:type="dxa" w:w="2296"/>
           </w:tcPr>
           <w:p>
             <w:r>
@@ -2055,7 +2062,7 @@
         </w:tc>
         <w:tc>
           <w:tcPr>
-            <w:tcW w:type="dxa" w:w="2379"/>
+            <w:tcW w:type="dxa" w:w="2296"/>
           </w:tcPr>
           <w:p>
             <w:r>
@@ -2073,7 +2080,7 @@
         </w:tc>
         <w:tc>
           <w:tcPr>
-            <w:tcW w:type="dxa" w:w="2379"/>
+            <w:tcW w:type="dxa" w:w="2296"/>
           </w:tcPr>
           <w:p>
             <w:r>
@@ -2091,7 +2098,7 @@
         </w:tc>
         <w:tc>
           <w:tcPr>
-            <w:tcW w:type="dxa" w:w="2379"/>
+            <w:tcW w:type="dxa" w:w="2296"/>
           </w:tcPr>
           <w:p>
             <w:r>
@@ -2111,7 +2118,7 @@
       <w:tr>
         <w:tc>
           <w:tcPr>
-            <w:tcW w:type="dxa" w:w="2379"/>
+            <w:tcW w:type="dxa" w:w="2296"/>
             <w:shd w:val="clear" w:fill="F2F7F7"/>
           </w:tcPr>
           <w:p>
@@ -2130,7 +2137,7 @@
         </w:tc>
         <w:tc>
           <w:tcPr>
-            <w:tcW w:type="dxa" w:w="2379"/>
+            <w:tcW w:type="dxa" w:w="2296"/>
             <w:shd w:val="clear" w:fill="F2F7F7"/>
           </w:tcPr>
           <w:p>
@@ -2149,7 +2156,7 @@
         </w:tc>
         <w:tc>
           <w:tcPr>
-            <w:tcW w:type="dxa" w:w="2379"/>
+            <w:tcW w:type="dxa" w:w="2296"/>
             <w:shd w:val="clear" w:fill="F2F7F7"/>
           </w:tcPr>
           <w:p>
@@ -2168,7 +2175,7 @@
         </w:tc>
         <w:tc>
           <w:tcPr>
-            <w:tcW w:type="dxa" w:w="2379"/>
+            <w:tcW w:type="dxa" w:w="2296"/>
             <w:shd w:val="clear" w:fill="F2F7F7"/>
           </w:tcPr>
           <w:p>
@@ -2189,7 +2196,7 @@
       <w:tr>
         <w:tc>
           <w:tcPr>
-            <w:tcW w:type="dxa" w:w="2379"/>
+            <w:tcW w:type="dxa" w:w="2296"/>
           </w:tcPr>
           <w:p>
             <w:r>
@@ -2207,7 +2214,7 @@
         </w:tc>
         <w:tc>
           <w:tcPr>
-            <w:tcW w:type="dxa" w:w="2379"/>
+            <w:tcW w:type="dxa" w:w="2296"/>
           </w:tcPr>
           <w:p>
             <w:r>
@@ -2225,7 +2232,7 @@
         </w:tc>
         <w:tc>
           <w:tcPr>
-            <w:tcW w:type="dxa" w:w="2379"/>
+            <w:tcW w:type="dxa" w:w="2296"/>
           </w:tcPr>
           <w:p>
             <w:r>
@@ -2243,7 +2250,7 @@
         </w:tc>
         <w:tc>
           <w:tcPr>
-            <w:tcW w:type="dxa" w:w="2379"/>
+            <w:tcW w:type="dxa" w:w="2296"/>
           </w:tcPr>
           <w:p>
             <w:r>
@@ -2263,7 +2270,7 @@
       <w:tr>
         <w:tc>
           <w:tcPr>
-            <w:tcW w:type="dxa" w:w="2379"/>
+            <w:tcW w:type="dxa" w:w="2296"/>
             <w:shd w:val="clear" w:fill="F2F7F7"/>
           </w:tcPr>
           <w:p>
@@ -2282,7 +2289,7 @@
         </w:tc>
         <w:tc>
           <w:tcPr>
-            <w:tcW w:type="dxa" w:w="2379"/>
+            <w:tcW w:type="dxa" w:w="2296"/>
             <w:shd w:val="clear" w:fill="F2F7F7"/>
           </w:tcPr>
           <w:p>
@@ -2301,7 +2308,7 @@
         </w:tc>
         <w:tc>
           <w:tcPr>
-            <w:tcW w:type="dxa" w:w="2379"/>
+            <w:tcW w:type="dxa" w:w="2296"/>
             <w:shd w:val="clear" w:fill="F2F7F7"/>
           </w:tcPr>
           <w:p>
@@ -2320,7 +2327,7 @@
         </w:tc>
         <w:tc>
           <w:tcPr>
-            <w:tcW w:type="dxa" w:w="2379"/>
+            <w:tcW w:type="dxa" w:w="2296"/>
             <w:shd w:val="clear" w:fill="F2F7F7"/>
           </w:tcPr>
           <w:p>
@@ -2341,7 +2348,7 @@
       <w:tr>
         <w:tc>
           <w:tcPr>
-            <w:tcW w:type="dxa" w:w="2379"/>
+            <w:tcW w:type="dxa" w:w="2296"/>
           </w:tcPr>
           <w:p>
             <w:r>
@@ -2359,7 +2366,7 @@
         </w:tc>
         <w:tc>
           <w:tcPr>
-            <w:tcW w:type="dxa" w:w="2379"/>
+            <w:tcW w:type="dxa" w:w="2296"/>
           </w:tcPr>
           <w:p>
             <w:r>
@@ -2377,7 +2384,7 @@
         </w:tc>
         <w:tc>
           <w:tcPr>
-            <w:tcW w:type="dxa" w:w="2379"/>
+            <w:tcW w:type="dxa" w:w="2296"/>
           </w:tcPr>
           <w:p>
             <w:r>
@@ -2395,7 +2402,7 @@
         </w:tc>
         <w:tc>
           <w:tcPr>
-            <w:tcW w:type="dxa" w:w="2379"/>
+            <w:tcW w:type="dxa" w:w="2296"/>
           </w:tcPr>
           <w:p>
             <w:r>
@@ -2415,7 +2422,7 @@
       <w:tr>
         <w:tc>
           <w:tcPr>
-            <w:tcW w:type="dxa" w:w="2379"/>
+            <w:tcW w:type="dxa" w:w="2296"/>
             <w:shd w:val="clear" w:fill="F2F7F7"/>
           </w:tcPr>
           <w:p>
@@ -2434,7 +2441,7 @@
         </w:tc>
         <w:tc>
           <w:tcPr>
-            <w:tcW w:type="dxa" w:w="2379"/>
+            <w:tcW w:type="dxa" w:w="2296"/>
             <w:shd w:val="clear" w:fill="F2F7F7"/>
           </w:tcPr>
           <w:p>
@@ -2453,7 +2460,7 @@
         </w:tc>
         <w:tc>
           <w:tcPr>
-            <w:tcW w:type="dxa" w:w="2379"/>
+            <w:tcW w:type="dxa" w:w="2296"/>
             <w:shd w:val="clear" w:fill="F2F7F7"/>
           </w:tcPr>
           <w:p>
@@ -2472,7 +2479,7 @@
         </w:tc>
         <w:tc>
           <w:tcPr>
-            <w:tcW w:type="dxa" w:w="2379"/>
+            <w:tcW w:type="dxa" w:w="2296"/>
             <w:shd w:val="clear" w:fill="F2F7F7"/>
           </w:tcPr>
           <w:p>
@@ -2493,7 +2500,7 @@
       <w:tr>
         <w:tc>
           <w:tcPr>
-            <w:tcW w:type="dxa" w:w="2379"/>
+            <w:tcW w:type="dxa" w:w="2296"/>
           </w:tcPr>
           <w:p>
             <w:r>
@@ -2511,7 +2518,7 @@
         </w:tc>
         <w:tc>
           <w:tcPr>
-            <w:tcW w:type="dxa" w:w="2379"/>
+            <w:tcW w:type="dxa" w:w="2296"/>
           </w:tcPr>
           <w:p>
             <w:r>
@@ -2529,7 +2536,7 @@
         </w:tc>
         <w:tc>
           <w:tcPr>
-            <w:tcW w:type="dxa" w:w="2379"/>
+            <w:tcW w:type="dxa" w:w="2296"/>
           </w:tcPr>
           <w:p>
             <w:r>
@@ -2547,7 +2554,7 @@
         </w:tc>
         <w:tc>
           <w:tcPr>
-            <w:tcW w:type="dxa" w:w="2379"/>
+            <w:tcW w:type="dxa" w:w="2296"/>
           </w:tcPr>
           <w:p>
             <w:r>
@@ -2567,7 +2574,7 @@
       <w:tr>
         <w:tc>
           <w:tcPr>
-            <w:tcW w:type="dxa" w:w="2379"/>
+            <w:tcW w:type="dxa" w:w="2296"/>
             <w:shd w:val="clear" w:fill="F2F7F7"/>
           </w:tcPr>
           <w:p>
@@ -2586,7 +2593,7 @@
         </w:tc>
         <w:tc>
           <w:tcPr>
-            <w:tcW w:type="dxa" w:w="2379"/>
+            <w:tcW w:type="dxa" w:w="2296"/>
             <w:shd w:val="clear" w:fill="F2F7F7"/>
           </w:tcPr>
           <w:p>
@@ -2605,7 +2612,7 @@
         </w:tc>
         <w:tc>
           <w:tcPr>
-            <w:tcW w:type="dxa" w:w="2379"/>
+            <w:tcW w:type="dxa" w:w="2296"/>
             <w:shd w:val="clear" w:fill="F2F7F7"/>
           </w:tcPr>
           <w:p>
@@ -2624,7 +2631,7 @@
         </w:tc>
         <w:tc>
           <w:tcPr>
-            <w:tcW w:type="dxa" w:w="2379"/>
+            <w:tcW w:type="dxa" w:w="2296"/>
             <w:shd w:val="clear" w:fill="F2F7F7"/>
           </w:tcPr>
           <w:p>
@@ -2645,7 +2652,7 @@
       <w:tr>
         <w:tc>
           <w:tcPr>
-            <w:tcW w:type="dxa" w:w="2379"/>
+            <w:tcW w:type="dxa" w:w="2296"/>
           </w:tcPr>
           <w:p>
             <w:r>
@@ -2663,7 +2670,7 @@
         </w:tc>
         <w:tc>
           <w:tcPr>
-            <w:tcW w:type="dxa" w:w="2379"/>
+            <w:tcW w:type="dxa" w:w="2296"/>
           </w:tcPr>
           <w:p>
             <w:r>
@@ -2681,7 +2688,7 @@
         </w:tc>
         <w:tc>
           <w:tcPr>
-            <w:tcW w:type="dxa" w:w="2379"/>
+            <w:tcW w:type="dxa" w:w="2296"/>
           </w:tcPr>
           <w:p>
             <w:r>
@@ -2699,7 +2706,7 @@
         </w:tc>
         <w:tc>
           <w:tcPr>
-            <w:tcW w:type="dxa" w:w="2379"/>
+            <w:tcW w:type="dxa" w:w="2296"/>
           </w:tcPr>
           <w:p>
             <w:r>
@@ -2719,7 +2726,7 @@
       <w:tr>
         <w:tc>
           <w:tcPr>
-            <w:tcW w:type="dxa" w:w="2379"/>
+            <w:tcW w:type="dxa" w:w="2296"/>
             <w:shd w:val="clear" w:fill="F2F7F7"/>
           </w:tcPr>
           <w:p>
@@ -2738,7 +2745,7 @@
         </w:tc>
         <w:tc>
           <w:tcPr>
-            <w:tcW w:type="dxa" w:w="2379"/>
+            <w:tcW w:type="dxa" w:w="2296"/>
             <w:shd w:val="clear" w:fill="F2F7F7"/>
           </w:tcPr>
           <w:p>
@@ -2757,7 +2764,7 @@
         </w:tc>
         <w:tc>
           <w:tcPr>
-            <w:tcW w:type="dxa" w:w="2379"/>
+            <w:tcW w:type="dxa" w:w="2296"/>
             <w:shd w:val="clear" w:fill="F2F7F7"/>
           </w:tcPr>
           <w:p>
@@ -2776,7 +2783,7 @@
         </w:tc>
         <w:tc>
           <w:tcPr>
-            <w:tcW w:type="dxa" w:w="2379"/>
+            <w:tcW w:type="dxa" w:w="2296"/>
             <w:shd w:val="clear" w:fill="F2F7F7"/>
           </w:tcPr>
           <w:p>
@@ -2797,7 +2804,7 @@
       <w:tr>
         <w:tc>
           <w:tcPr>
-            <w:tcW w:type="dxa" w:w="2379"/>
+            <w:tcW w:type="dxa" w:w="2296"/>
           </w:tcPr>
           <w:p>
             <w:r>
@@ -2815,7 +2822,7 @@
         </w:tc>
         <w:tc>
           <w:tcPr>
-            <w:tcW w:type="dxa" w:w="2379"/>
+            <w:tcW w:type="dxa" w:w="2296"/>
           </w:tcPr>
           <w:p>
             <w:r>
@@ -2833,7 +2840,7 @@
         </w:tc>
         <w:tc>
           <w:tcPr>
-            <w:tcW w:type="dxa" w:w="2379"/>
+            <w:tcW w:type="dxa" w:w="2296"/>
           </w:tcPr>
           <w:p>
             <w:r>
@@ -2851,7 +2858,7 @@
         </w:tc>
         <w:tc>
           <w:tcPr>
-            <w:tcW w:type="dxa" w:w="2379"/>
+            <w:tcW w:type="dxa" w:w="2296"/>
           </w:tcPr>
           <w:p>
             <w:r>
@@ -2871,7 +2878,7 @@
       <w:tr>
         <w:tc>
           <w:tcPr>
-            <w:tcW w:type="dxa" w:w="2379"/>
+            <w:tcW w:type="dxa" w:w="2296"/>
             <w:shd w:val="clear" w:fill="F2F7F7"/>
           </w:tcPr>
           <w:p>
@@ -2890,7 +2897,7 @@
         </w:tc>
         <w:tc>
           <w:tcPr>
-            <w:tcW w:type="dxa" w:w="2379"/>
+            <w:tcW w:type="dxa" w:w="2296"/>
             <w:shd w:val="clear" w:fill="F2F7F7"/>
           </w:tcPr>
           <w:p>
@@ -2909,7 +2916,7 @@
         </w:tc>
         <w:tc>
           <w:tcPr>
-            <w:tcW w:type="dxa" w:w="2379"/>
+            <w:tcW w:type="dxa" w:w="2296"/>
             <w:shd w:val="clear" w:fill="F2F7F7"/>
           </w:tcPr>
           <w:p>
@@ -2928,7 +2935,7 @@
         </w:tc>
         <w:tc>
           <w:tcPr>
-            <w:tcW w:type="dxa" w:w="2379"/>
+            <w:tcW w:type="dxa" w:w="2296"/>
             <w:shd w:val="clear" w:fill="F2F7F7"/>
           </w:tcPr>
           <w:p>
@@ -2949,7 +2956,7 @@
       <w:tr>
         <w:tc>
           <w:tcPr>
-            <w:tcW w:type="dxa" w:w="2379"/>
+            <w:tcW w:type="dxa" w:w="2296"/>
           </w:tcPr>
           <w:p>
             <w:r>
@@ -2967,7 +2974,7 @@
         </w:tc>
         <w:tc>
           <w:tcPr>
-            <w:tcW w:type="dxa" w:w="2379"/>
+            <w:tcW w:type="dxa" w:w="2296"/>
           </w:tcPr>
           <w:p>
             <w:r>
@@ -2985,7 +2992,7 @@
         </w:tc>
         <w:tc>
           <w:tcPr>
-            <w:tcW w:type="dxa" w:w="2379"/>
+            <w:tcW w:type="dxa" w:w="2296"/>
           </w:tcPr>
           <w:p>
             <w:r>
@@ -3003,7 +3010,7 @@
         </w:tc>
         <w:tc>
           <w:tcPr>
-            <w:tcW w:type="dxa" w:w="2379"/>
+            <w:tcW w:type="dxa" w:w="2296"/>
           </w:tcPr>
           <w:p>
             <w:r>
@@ -3023,7 +3030,7 @@
       <w:tr>
         <w:tc>
           <w:tcPr>
-            <w:tcW w:type="dxa" w:w="2379"/>
+            <w:tcW w:type="dxa" w:w="2296"/>
             <w:shd w:val="clear" w:fill="F2F7F7"/>
           </w:tcPr>
           <w:p>
@@ -3042,7 +3049,7 @@
         </w:tc>
         <w:tc>
           <w:tcPr>
-            <w:tcW w:type="dxa" w:w="2379"/>
+            <w:tcW w:type="dxa" w:w="2296"/>
             <w:shd w:val="clear" w:fill="F2F7F7"/>
           </w:tcPr>
           <w:p>
@@ -3061,7 +3068,7 @@
         </w:tc>
         <w:tc>
           <w:tcPr>
-            <w:tcW w:type="dxa" w:w="2379"/>
+            <w:tcW w:type="dxa" w:w="2296"/>
             <w:shd w:val="clear" w:fill="F2F7F7"/>
           </w:tcPr>
           <w:p>
@@ -3080,7 +3087,7 @@
         </w:tc>
         <w:tc>
           <w:tcPr>
-            <w:tcW w:type="dxa" w:w="2379"/>
+            <w:tcW w:type="dxa" w:w="2296"/>
             <w:shd w:val="clear" w:fill="F2F7F7"/>
           </w:tcPr>
           <w:p>
@@ -3101,7 +3108,7 @@
       <w:tr>
         <w:tc>
           <w:tcPr>
-            <w:tcW w:type="dxa" w:w="2379"/>
+            <w:tcW w:type="dxa" w:w="2296"/>
           </w:tcPr>
           <w:p>
             <w:r>
@@ -3119,7 +3126,7 @@
         </w:tc>
         <w:tc>
           <w:tcPr>
-            <w:tcW w:type="dxa" w:w="2379"/>
+            <w:tcW w:type="dxa" w:w="2296"/>
           </w:tcPr>
           <w:p>
             <w:r>
@@ -3137,7 +3144,7 @@
         </w:tc>
         <w:tc>
           <w:tcPr>
-            <w:tcW w:type="dxa" w:w="2379"/>
+            <w:tcW w:type="dxa" w:w="2296"/>
           </w:tcPr>
           <w:p>
             <w:r>
@@ -3155,7 +3162,7 @@
         </w:tc>
         <w:tc>
           <w:tcPr>
-            <w:tcW w:type="dxa" w:w="2379"/>
+            <w:tcW w:type="dxa" w:w="2296"/>
           </w:tcPr>
           <w:p>
             <w:r>
@@ -3175,7 +3182,7 @@
       <w:tr>
         <w:tc>
           <w:tcPr>
-            <w:tcW w:type="dxa" w:w="2379"/>
+            <w:tcW w:type="dxa" w:w="2296"/>
             <w:shd w:val="clear" w:fill="F2F7F7"/>
           </w:tcPr>
           <w:p>
@@ -3194,7 +3201,7 @@
         </w:tc>
         <w:tc>
           <w:tcPr>
-            <w:tcW w:type="dxa" w:w="2379"/>
+            <w:tcW w:type="dxa" w:w="2296"/>
             <w:shd w:val="clear" w:fill="F2F7F7"/>
           </w:tcPr>
           <w:p>
@@ -3213,7 +3220,7 @@
         </w:tc>
         <w:tc>
           <w:tcPr>
-            <w:tcW w:type="dxa" w:w="2379"/>
+            <w:tcW w:type="dxa" w:w="2296"/>
             <w:shd w:val="clear" w:fill="F2F7F7"/>
           </w:tcPr>
           <w:p>
@@ -3232,7 +3239,7 @@
         </w:tc>
         <w:tc>
           <w:tcPr>
-            <w:tcW w:type="dxa" w:w="2379"/>
+            <w:tcW w:type="dxa" w:w="2296"/>
             <w:shd w:val="clear" w:fill="F2F7F7"/>
           </w:tcPr>
           <w:p>
@@ -3253,7 +3260,7 @@
       <w:tr>
         <w:tc>
           <w:tcPr>
-            <w:tcW w:type="dxa" w:w="2379"/>
+            <w:tcW w:type="dxa" w:w="2296"/>
           </w:tcPr>
           <w:p>
             <w:r>
@@ -3271,7 +3278,7 @@
         </w:tc>
         <w:tc>
           <w:tcPr>
-            <w:tcW w:type="dxa" w:w="2379"/>
+            <w:tcW w:type="dxa" w:w="2296"/>
           </w:tcPr>
           <w:p>
             <w:r>
@@ -3289,7 +3296,7 @@
         </w:tc>
         <w:tc>
           <w:tcPr>
-            <w:tcW w:type="dxa" w:w="2379"/>
+            <w:tcW w:type="dxa" w:w="2296"/>
           </w:tcPr>
           <w:p>
             <w:r>
@@ -3307,7 +3314,7 @@
         </w:tc>
         <w:tc>
           <w:tcPr>
-            <w:tcW w:type="dxa" w:w="2379"/>
+            <w:tcW w:type="dxa" w:w="2296"/>
           </w:tcPr>
           <w:p>
             <w:r>
@@ -3327,7 +3334,7 @@
       <w:tr>
         <w:tc>
           <w:tcPr>
-            <w:tcW w:type="dxa" w:w="2379"/>
+            <w:tcW w:type="dxa" w:w="2296"/>
             <w:shd w:val="clear" w:fill="F2F7F7"/>
           </w:tcPr>
           <w:p>
@@ -3346,7 +3353,7 @@
         </w:tc>
         <w:tc>
           <w:tcPr>
-            <w:tcW w:type="dxa" w:w="2379"/>
+            <w:tcW w:type="dxa" w:w="2296"/>
             <w:shd w:val="clear" w:fill="F2F7F7"/>
           </w:tcPr>
           <w:p>
@@ -3365,7 +3372,7 @@
         </w:tc>
         <w:tc>
           <w:tcPr>
-            <w:tcW w:type="dxa" w:w="2379"/>
+            <w:tcW w:type="dxa" w:w="2296"/>
             <w:shd w:val="clear" w:fill="F2F7F7"/>
           </w:tcPr>
           <w:p>
@@ -3384,7 +3391,7 @@
         </w:tc>
         <w:tc>
           <w:tcPr>
-            <w:tcW w:type="dxa" w:w="2379"/>
+            <w:tcW w:type="dxa" w:w="2296"/>
             <w:shd w:val="clear" w:fill="F2F7F7"/>
           </w:tcPr>
           <w:p>
@@ -3405,7 +3412,7 @@
       <w:tr>
         <w:tc>
           <w:tcPr>
-            <w:tcW w:type="dxa" w:w="2379"/>
+            <w:tcW w:type="dxa" w:w="2296"/>
           </w:tcPr>
           <w:p>
             <w:r>
@@ -3423,7 +3430,7 @@
         </w:tc>
         <w:tc>
           <w:tcPr>
-            <w:tcW w:type="dxa" w:w="2379"/>
+            <w:tcW w:type="dxa" w:w="2296"/>
           </w:tcPr>
           <w:p>
             <w:r>
@@ -3441,7 +3448,7 @@
         </w:tc>
         <w:tc>
           <w:tcPr>
-            <w:tcW w:type="dxa" w:w="2379"/>
+            <w:tcW w:type="dxa" w:w="2296"/>
           </w:tcPr>
           <w:p>
             <w:r>
@@ -3459,7 +3466,7 @@
         </w:tc>
         <w:tc>
           <w:tcPr>
-            <w:tcW w:type="dxa" w:w="2379"/>
+            <w:tcW w:type="dxa" w:w="2296"/>
           </w:tcPr>
           <w:p>
             <w:r>
@@ -3479,7 +3486,7 @@
       <w:tr>
         <w:tc>
           <w:tcPr>
-            <w:tcW w:type="dxa" w:w="2379"/>
+            <w:tcW w:type="dxa" w:w="2296"/>
             <w:shd w:val="clear" w:fill="F2F7F7"/>
           </w:tcPr>
           <w:p>
@@ -3498,7 +3505,7 @@
         </w:tc>
         <w:tc>
           <w:tcPr>
-            <w:tcW w:type="dxa" w:w="2379"/>
+            <w:tcW w:type="dxa" w:w="2296"/>
             <w:shd w:val="clear" w:fill="F2F7F7"/>
           </w:tcPr>
           <w:p>
@@ -3517,7 +3524,7 @@
         </w:tc>
         <w:tc>
           <w:tcPr>
-            <w:tcW w:type="dxa" w:w="2379"/>
+            <w:tcW w:type="dxa" w:w="2296"/>
             <w:shd w:val="clear" w:fill="F2F7F7"/>
           </w:tcPr>
           <w:p>
@@ -3536,7 +3543,7 @@
         </w:tc>
         <w:tc>
           <w:tcPr>
-            <w:tcW w:type="dxa" w:w="2379"/>
+            <w:tcW w:type="dxa" w:w="2296"/>
             <w:shd w:val="clear" w:fill="F2F7F7"/>
           </w:tcPr>
           <w:p>
@@ -3557,7 +3564,7 @@
       <w:tr>
         <w:tc>
           <w:tcPr>
-            <w:tcW w:type="dxa" w:w="2379"/>
+            <w:tcW w:type="dxa" w:w="2296"/>
           </w:tcPr>
           <w:p>
             <w:r>
@@ -3575,7 +3582,7 @@
         </w:tc>
         <w:tc>
           <w:tcPr>
-            <w:tcW w:type="dxa" w:w="2379"/>
+            <w:tcW w:type="dxa" w:w="2296"/>
           </w:tcPr>
           <w:p>
             <w:r>
@@ -3593,7 +3600,7 @@
         </w:tc>
         <w:tc>
           <w:tcPr>
-            <w:tcW w:type="dxa" w:w="2379"/>
+            <w:tcW w:type="dxa" w:w="2296"/>
           </w:tcPr>
           <w:p>
             <w:r>
@@ -3611,7 +3618,7 @@
         </w:tc>
         <w:tc>
           <w:tcPr>
-            <w:tcW w:type="dxa" w:w="2379"/>
+            <w:tcW w:type="dxa" w:w="2296"/>
           </w:tcPr>
           <w:p>
             <w:r>
@@ -3631,7 +3638,7 @@
       <w:tr>
         <w:tc>
           <w:tcPr>
-            <w:tcW w:type="dxa" w:w="2379"/>
+            <w:tcW w:type="dxa" w:w="2296"/>
             <w:shd w:val="clear" w:fill="F2F7F7"/>
           </w:tcPr>
           <w:p>
@@ -3650,7 +3657,7 @@
         </w:tc>
         <w:tc>
           <w:tcPr>
-            <w:tcW w:type="dxa" w:w="2379"/>
+            <w:tcW w:type="dxa" w:w="2296"/>
             <w:shd w:val="clear" w:fill="F2F7F7"/>
           </w:tcPr>
           <w:p>
@@ -3669,7 +3676,7 @@
         </w:tc>
         <w:tc>
           <w:tcPr>
-            <w:tcW w:type="dxa" w:w="2379"/>
+            <w:tcW w:type="dxa" w:w="2296"/>
             <w:shd w:val="clear" w:fill="F2F7F7"/>
           </w:tcPr>
           <w:p>
@@ -3688,7 +3695,7 @@
         </w:tc>
         <w:tc>
           <w:tcPr>
-            <w:tcW w:type="dxa" w:w="2379"/>
+            <w:tcW w:type="dxa" w:w="2296"/>
             <w:shd w:val="clear" w:fill="F2F7F7"/>
           </w:tcPr>
           <w:p>
@@ -3709,7 +3716,7 @@
       <w:tr>
         <w:tc>
           <w:tcPr>
-            <w:tcW w:type="dxa" w:w="2379"/>
+            <w:tcW w:type="dxa" w:w="2296"/>
           </w:tcPr>
           <w:p>
             <w:r>
@@ -3727,7 +3734,7 @@
         </w:tc>
         <w:tc>
           <w:tcPr>
-            <w:tcW w:type="dxa" w:w="2379"/>
+            <w:tcW w:type="dxa" w:w="2296"/>
           </w:tcPr>
           <w:p>
             <w:r>
@@ -3745,7 +3752,7 @@
         </w:tc>
         <w:tc>
           <w:tcPr>
-            <w:tcW w:type="dxa" w:w="2379"/>
+            <w:tcW w:type="dxa" w:w="2296"/>
           </w:tcPr>
           <w:p>
             <w:r>
@@ -3763,7 +3770,7 @@
         </w:tc>
         <w:tc>
           <w:tcPr>
-            <w:tcW w:type="dxa" w:w="2379"/>
+            <w:tcW w:type="dxa" w:w="2296"/>
           </w:tcPr>
           <w:p>
             <w:r>
@@ -3783,7 +3790,7 @@
       <w:tr>
         <w:tc>
           <w:tcPr>
-            <w:tcW w:type="dxa" w:w="2379"/>
+            <w:tcW w:type="dxa" w:w="2296"/>
             <w:shd w:val="clear" w:fill="F2F7F7"/>
           </w:tcPr>
           <w:p>
@@ -3802,7 +3809,7 @@
         </w:tc>
         <w:tc>
           <w:tcPr>
-            <w:tcW w:type="dxa" w:w="2379"/>
+            <w:tcW w:type="dxa" w:w="2296"/>
             <w:shd w:val="clear" w:fill="F2F7F7"/>
           </w:tcPr>
           <w:p>
@@ -3821,7 +3828,7 @@
         </w:tc>
         <w:tc>
           <w:tcPr>
-            <w:tcW w:type="dxa" w:w="2379"/>
+            <w:tcW w:type="dxa" w:w="2296"/>
             <w:shd w:val="clear" w:fill="F2F7F7"/>
           </w:tcPr>
           <w:p>
@@ -3840,7 +3847,7 @@
         </w:tc>
         <w:tc>
           <w:tcPr>
-            <w:tcW w:type="dxa" w:w="2379"/>
+            <w:tcW w:type="dxa" w:w="2296"/>
             <w:shd w:val="clear" w:fill="F2F7F7"/>
           </w:tcPr>
           <w:p>
@@ -3861,7 +3868,7 @@
       <w:tr>
         <w:tc>
           <w:tcPr>
-            <w:tcW w:type="dxa" w:w="2379"/>
+            <w:tcW w:type="dxa" w:w="2296"/>
           </w:tcPr>
           <w:p>
             <w:r>
@@ -3879,7 +3886,7 @@
         </w:tc>
         <w:tc>
           <w:tcPr>
-            <w:tcW w:type="dxa" w:w="2379"/>
+            <w:tcW w:type="dxa" w:w="2296"/>
           </w:tcPr>
           <w:p>
             <w:r>
@@ -3897,7 +3904,7 @@
         </w:tc>
         <w:tc>
           <w:tcPr>
-            <w:tcW w:type="dxa" w:w="2379"/>
+            <w:tcW w:type="dxa" w:w="2296"/>
           </w:tcPr>
           <w:p>
             <w:r>
@@ -3915,7 +3922,7 @@
         </w:tc>
         <w:tc>
           <w:tcPr>
-            <w:tcW w:type="dxa" w:w="2379"/>
+            <w:tcW w:type="dxa" w:w="2296"/>
           </w:tcPr>
           <w:p>
             <w:r>
@@ -3935,7 +3942,7 @@
       <w:tr>
         <w:tc>
           <w:tcPr>
-            <w:tcW w:type="dxa" w:w="2379"/>
+            <w:tcW w:type="dxa" w:w="2296"/>
             <w:shd w:val="clear" w:fill="F2F7F7"/>
           </w:tcPr>
           <w:p>
@@ -3954,7 +3961,7 @@
         </w:tc>
         <w:tc>
           <w:tcPr>
-            <w:tcW w:type="dxa" w:w="2379"/>
+            <w:tcW w:type="dxa" w:w="2296"/>
             <w:shd w:val="clear" w:fill="F2F7F7"/>
           </w:tcPr>
           <w:p>
@@ -3973,7 +3980,7 @@
         </w:tc>
         <w:tc>
           <w:tcPr>
-            <w:tcW w:type="dxa" w:w="2379"/>
+            <w:tcW w:type="dxa" w:w="2296"/>
             <w:shd w:val="clear" w:fill="F2F7F7"/>
           </w:tcPr>
           <w:p>
@@ -3992,7 +3999,7 @@
         </w:tc>
         <w:tc>
           <w:tcPr>
-            <w:tcW w:type="dxa" w:w="2379"/>
+            <w:tcW w:type="dxa" w:w="2296"/>
             <w:shd w:val="clear" w:fill="F2F7F7"/>
           </w:tcPr>
           <w:p>
@@ -4013,7 +4020,7 @@
       <w:tr>
         <w:tc>
           <w:tcPr>
-            <w:tcW w:type="dxa" w:w="2379"/>
+            <w:tcW w:type="dxa" w:w="2296"/>
           </w:tcPr>
           <w:p>
             <w:r>
@@ -4031,7 +4038,7 @@
         </w:tc>
         <w:tc>
           <w:tcPr>
-            <w:tcW w:type="dxa" w:w="2379"/>
+            <w:tcW w:type="dxa" w:w="2296"/>
           </w:tcPr>
           <w:p>
             <w:r>
@@ -4049,7 +4056,7 @@
         </w:tc>
         <w:tc>
           <w:tcPr>
-            <w:tcW w:type="dxa" w:w="2379"/>
+            <w:tcW w:type="dxa" w:w="2296"/>
           </w:tcPr>
           <w:p>
             <w:r>
@@ -4067,7 +4074,7 @@
         </w:tc>
         <w:tc>
           <w:tcPr>
-            <w:tcW w:type="dxa" w:w="2379"/>
+            <w:tcW w:type="dxa" w:w="2296"/>
           </w:tcPr>
           <w:p>
             <w:r>
@@ -4087,7 +4094,7 @@
       <w:tr>
         <w:tc>
           <w:tcPr>
-            <w:tcW w:type="dxa" w:w="2379"/>
+            <w:tcW w:type="dxa" w:w="2296"/>
             <w:shd w:val="clear" w:fill="F2F7F7"/>
           </w:tcPr>
           <w:p>
@@ -4106,7 +4113,7 @@
         </w:tc>
         <w:tc>
           <w:tcPr>
-            <w:tcW w:type="dxa" w:w="2379"/>
+            <w:tcW w:type="dxa" w:w="2296"/>
             <w:shd w:val="clear" w:fill="F2F7F7"/>
           </w:tcPr>
           <w:p>
@@ -4125,7 +4132,7 @@
         </w:tc>
         <w:tc>
           <w:tcPr>
-            <w:tcW w:type="dxa" w:w="2379"/>
+            <w:tcW w:type="dxa" w:w="2296"/>
             <w:shd w:val="clear" w:fill="F2F7F7"/>
           </w:tcPr>
           <w:p>
@@ -4144,7 +4151,7 @@
         </w:tc>
         <w:tc>
           <w:tcPr>
-            <w:tcW w:type="dxa" w:w="2379"/>
+            <w:tcW w:type="dxa" w:w="2296"/>
             <w:shd w:val="clear" w:fill="F2F7F7"/>
           </w:tcPr>
           <w:p>
@@ -4165,7 +4172,7 @@
       <w:tr>
         <w:tc>
           <w:tcPr>
-            <w:tcW w:type="dxa" w:w="2379"/>
+            <w:tcW w:type="dxa" w:w="2296"/>
           </w:tcPr>
           <w:p>
             <w:r>
@@ -4183,7 +4190,7 @@
         </w:tc>
         <w:tc>
           <w:tcPr>
-            <w:tcW w:type="dxa" w:w="2379"/>
+            <w:tcW w:type="dxa" w:w="2296"/>
           </w:tcPr>
           <w:p>
             <w:r>
@@ -4201,7 +4208,7 @@
         </w:tc>
         <w:tc>
           <w:tcPr>
-            <w:tcW w:type="dxa" w:w="2379"/>
+            <w:tcW w:type="dxa" w:w="2296"/>
           </w:tcPr>
           <w:p>
             <w:r>
@@ -4219,7 +4226,7 @@
         </w:tc>
         <w:tc>
           <w:tcPr>
-            <w:tcW w:type="dxa" w:w="2379"/>
+            <w:tcW w:type="dxa" w:w="2296"/>
           </w:tcPr>
           <w:p>
             <w:r>
@@ -4239,7 +4246,7 @@
       <w:tr>
         <w:tc>
           <w:tcPr>
-            <w:tcW w:type="dxa" w:w="2379"/>
+            <w:tcW w:type="dxa" w:w="2296"/>
             <w:shd w:val="clear" w:fill="F2F7F7"/>
           </w:tcPr>
           <w:p>
@@ -4258,7 +4265,7 @@
         </w:tc>
         <w:tc>
           <w:tcPr>
-            <w:tcW w:type="dxa" w:w="2379"/>
+            <w:tcW w:type="dxa" w:w="2296"/>
             <w:shd w:val="clear" w:fill="F2F7F7"/>
           </w:tcPr>
           <w:p>
@@ -4277,7 +4284,7 @@
         </w:tc>
         <w:tc>
           <w:tcPr>
-            <w:tcW w:type="dxa" w:w="2379"/>
+            <w:tcW w:type="dxa" w:w="2296"/>
             <w:shd w:val="clear" w:fill="F2F7F7"/>
           </w:tcPr>
           <w:p>
@@ -4296,7 +4303,7 @@
         </w:tc>
         <w:tc>
           <w:tcPr>
-            <w:tcW w:type="dxa" w:w="2379"/>
+            <w:tcW w:type="dxa" w:w="2296"/>
             <w:shd w:val="clear" w:fill="F2F7F7"/>
           </w:tcPr>
           <w:p>
@@ -4317,7 +4324,7 @@
       <w:tr>
         <w:tc>
           <w:tcPr>
-            <w:tcW w:type="dxa" w:w="2379"/>
+            <w:tcW w:type="dxa" w:w="2296"/>
           </w:tcPr>
           <w:p>
             <w:r>
@@ -4335,7 +4342,7 @@
         </w:tc>
         <w:tc>
           <w:tcPr>
-            <w:tcW w:type="dxa" w:w="2379"/>
+            <w:tcW w:type="dxa" w:w="2296"/>
           </w:tcPr>
           <w:p>
             <w:r>
@@ -4353,7 +4360,7 @@
         </w:tc>
         <w:tc>
           <w:tcPr>
-            <w:tcW w:type="dxa" w:w="2379"/>
+            <w:tcW w:type="dxa" w:w="2296"/>
           </w:tcPr>
           <w:p>
             <w:r>
@@ -4371,7 +4378,7 @@
         </w:tc>
         <w:tc>
           <w:tcPr>
-            <w:tcW w:type="dxa" w:w="2379"/>
+            <w:tcW w:type="dxa" w:w="2296"/>
           </w:tcPr>
           <w:p>
             <w:r>
@@ -4391,7 +4398,7 @@
       <w:tr>
         <w:tc>
           <w:tcPr>
-            <w:tcW w:type="dxa" w:w="2379"/>
+            <w:tcW w:type="dxa" w:w="2296"/>
             <w:shd w:val="clear" w:fill="F2F7F7"/>
           </w:tcPr>
           <w:p>
@@ -4410,7 +4417,7 @@
         </w:tc>
         <w:tc>
           <w:tcPr>
-            <w:tcW w:type="dxa" w:w="2379"/>
+            <w:tcW w:type="dxa" w:w="2296"/>
             <w:shd w:val="clear" w:fill="F2F7F7"/>
           </w:tcPr>
           <w:p>
@@ -4429,7 +4436,7 @@
         </w:tc>
         <w:tc>
           <w:tcPr>
-            <w:tcW w:type="dxa" w:w="2379"/>
+            <w:tcW w:type="dxa" w:w="2296"/>
             <w:shd w:val="clear" w:fill="F2F7F7"/>
           </w:tcPr>
           <w:p>
@@ -4448,7 +4455,7 @@
         </w:tc>
         <w:tc>
           <w:tcPr>
-            <w:tcW w:type="dxa" w:w="2379"/>
+            <w:tcW w:type="dxa" w:w="2296"/>
             <w:shd w:val="clear" w:fill="F2F7F7"/>
           </w:tcPr>
           <w:p>
@@ -4469,7 +4476,7 @@
       <w:tr>
         <w:tc>
           <w:tcPr>
-            <w:tcW w:type="dxa" w:w="2379"/>
+            <w:tcW w:type="dxa" w:w="2296"/>
           </w:tcPr>
           <w:p>
             <w:r>
@@ -4487,7 +4494,7 @@
         </w:tc>
         <w:tc>
           <w:tcPr>
-            <w:tcW w:type="dxa" w:w="2379"/>
+            <w:tcW w:type="dxa" w:w="2296"/>
           </w:tcPr>
           <w:p>
             <w:r>
@@ -4505,7 +4512,7 @@
         </w:tc>
         <w:tc>
           <w:tcPr>
-            <w:tcW w:type="dxa" w:w="2379"/>
+            <w:tcW w:type="dxa" w:w="2296"/>
           </w:tcPr>
           <w:p>
             <w:r>
@@ -4523,7 +4530,7 @@
         </w:tc>
         <w:tc>
           <w:tcPr>
-            <w:tcW w:type="dxa" w:w="2379"/>
+            <w:tcW w:type="dxa" w:w="2296"/>
           </w:tcPr>
           <w:p>
             <w:r>
@@ -4543,7 +4550,7 @@
       <w:tr>
         <w:tc>
           <w:tcPr>
-            <w:tcW w:type="dxa" w:w="2379"/>
+            <w:tcW w:type="dxa" w:w="2296"/>
             <w:shd w:val="clear" w:fill="F2F7F7"/>
           </w:tcPr>
           <w:p>
@@ -4562,7 +4569,7 @@
         </w:tc>
         <w:tc>
           <w:tcPr>
-            <w:tcW w:type="dxa" w:w="2379"/>
+            <w:tcW w:type="dxa" w:w="2296"/>
             <w:shd w:val="clear" w:fill="F2F7F7"/>
           </w:tcPr>
           <w:p>
@@ -4581,7 +4588,7 @@
         </w:tc>
         <w:tc>
           <w:tcPr>
-            <w:tcW w:type="dxa" w:w="2379"/>
+            <w:tcW w:type="dxa" w:w="2296"/>
             <w:shd w:val="clear" w:fill="F2F7F7"/>
           </w:tcPr>
           <w:p>
@@ -4600,7 +4607,7 @@
         </w:tc>
         <w:tc>
           <w:tcPr>
-            <w:tcW w:type="dxa" w:w="2379"/>
+            <w:tcW w:type="dxa" w:w="2296"/>
             <w:shd w:val="clear" w:fill="F2F7F7"/>
           </w:tcPr>
           <w:p>
@@ -4621,7 +4628,7 @@
       <w:tr>
         <w:tc>
           <w:tcPr>
-            <w:tcW w:type="dxa" w:w="2379"/>
+            <w:tcW w:type="dxa" w:w="2296"/>
           </w:tcPr>
           <w:p>
             <w:r>
@@ -4639,7 +4646,7 @@
         </w:tc>
         <w:tc>
           <w:tcPr>
-            <w:tcW w:type="dxa" w:w="2379"/>
+            <w:tcW w:type="dxa" w:w="2296"/>
           </w:tcPr>
           <w:p>
             <w:r>
@@ -4657,7 +4664,7 @@
         </w:tc>
         <w:tc>
           <w:tcPr>
-            <w:tcW w:type="dxa" w:w="2379"/>
+            <w:tcW w:type="dxa" w:w="2296"/>
           </w:tcPr>
           <w:p>
             <w:r>
@@ -4675,7 +4682,7 @@
         </w:tc>
         <w:tc>
           <w:tcPr>
-            <w:tcW w:type="dxa" w:w="2379"/>
+            <w:tcW w:type="dxa" w:w="2296"/>
           </w:tcPr>
           <w:p>
             <w:r>
@@ -4781,9 +4788,8 @@
     </w:p>
     <w:sectPr>
       <w:footerReference w:type="default" r:id="rId9"/>
-      <w:footerReference w:type="first" r:id="rId10"/>
-      <w:headerReference w:type="default" r:id="rId11"/>
-      <w:pgSz w:w="12240" w:h="15840"/>
+      <w:headerReference w:type="default" r:id="rId10"/>
+      <w:pgSz w:w="11906" w:h="16838"/>
       <w:pgMar w:top="1247" w:right="1361" w:bottom="1134" w:left="1361" w:header="720" w:footer="720" w:gutter="0"/>
       <w:cols w:space="720"/>
       <w:titlePg/>
@@ -4798,74 +4804,14 @@
   <w:p>
     <w:pPr>
       <w:pStyle w:val="Footer"/>
-      <w:tabs>
-        <w:tab w:pos="9518" w:val="right"/>
-      </w:tabs>
       <w:pBdr>
         <w:top w:val="single" w:sz="4" w:space="6" w:color="008490"/>
       </w:pBdr>
-    </w:pPr>
-    <w:r/>
-    <w:r>
-      <w:rPr>
-        <w:color w:val="6B7280"/>
-        <w:sz w:val="16"/>
-      </w:rPr>
-      <w:t>Intradark Pty Ltd  ·  ABN 38 696 182 457  ·  Commercial in confidence</w:t>
-    </w:r>
-    <w:r>
-      <w:rPr>
-        <w:sz w:val="16"/>
-      </w:rPr>
-      <w:tab/>
-    </w:r>
-    <w:r>
-      <w:rPr>
-        <w:color w:val="6B7280"/>
-        <w:sz w:val="16"/>
-      </w:rPr>
-      <w:t xml:space="preserve">Page </w:t>
-    </w:r>
-    <w:r>
-      <w:rPr>
-        <w:color w:val="6B7280"/>
-        <w:sz w:val="16"/>
-      </w:rPr>
-      <w:fldChar w:fldCharType="begin"/>
-      <w:instrText xml:space="preserve">PAGE</w:instrText>
-      <w:fldChar w:fldCharType="end"/>
-    </w:r>
-    <w:r>
-      <w:rPr>
-        <w:color w:val="6B7280"/>
-        <w:sz w:val="16"/>
-      </w:rPr>
-      <w:t xml:space="preserve"> of </w:t>
-    </w:r>
-    <w:r>
-      <w:rPr>
-        <w:color w:val="6B7280"/>
-        <w:sz w:val="16"/>
-      </w:rPr>
-      <w:fldChar w:fldCharType="begin"/>
-      <w:instrText xml:space="preserve">NUMPAGES</w:instrText>
-      <w:fldChar w:fldCharType="end"/>
-    </w:r>
-  </w:p>
-</w:ftr>
-</file>
-
-<file path=word/footer2.xml><?xml version="1.0" encoding="utf-8"?>
-<w:ftr xmlns:m="http://schemas.openxmlformats.org/officeDocument/2006/math" xmlns:mc="http://schemas.openxmlformats.org/markup-compatibility/2006" xmlns:mo="http://schemas.microsoft.com/office/mac/office/2008/main" xmlns:mv="urn:schemas-microsoft-com:mac:vml" xmlns:o="urn:schemas-microsoft-com:office:office" xmlns:r="http://schemas.openxmlformats.org/officeDocument/2006/relationships" xmlns:v="urn:schemas-microsoft-com:vml" xmlns:w10="urn:schemas-microsoft-com:office:word" xmlns:w14="http://schemas.microsoft.com/office/word/2010/wordml" xmlns:w="http://schemas.openxmlformats.org/wordprocessingml/2006/main" xmlns:wne="http://schemas.microsoft.com/office/word/2006/wordml" xmlns:wp14="http://schemas.microsoft.com/office/word/2010/wordprocessingDrawing" xmlns:wp="http://schemas.openxmlformats.org/drawingml/2006/wordprocessingDrawing" xmlns:wpc="http://schemas.microsoft.com/office/word/2010/wordprocessingCanvas" xmlns:wpg="http://schemas.microsoft.com/office/word/2010/wordprocessingGroup" xmlns:wpi="http://schemas.microsoft.com/office/word/2010/wordprocessingInk" xmlns:wps="http://schemas.microsoft.com/office/word/2010/wordprocessingShape" mc:Ignorable="w14 wp14">
-  <w:p>
-    <w:pPr>
-      <w:pStyle w:val="Footer"/>
       <w:tabs>
-        <w:tab w:pos="9518" w:val="right"/>
+        <w:tab w:val="clear" w:pos="4680"/>
+        <w:tab w:pos="9184" w:val="right"/>
+        <w:tab w:val="clear" w:pos="9360"/>
       </w:tabs>
-      <w:pBdr>
-        <w:top w:val="single" w:sz="4" w:space="6" w:color="008490"/>
-      </w:pBdr>
     </w:pPr>
     <w:r/>
     <w:r>

</xml_diff>